<commit_message>
Key features in design
</commit_message>
<xml_diff>
--- a/NEA.docx
+++ b/NEA.docx
@@ -2391,7 +2391,23 @@
           </w:tcPr>
           <w:p>
             <w:r>
-              <w:t>Choose PvP or PvAI, board color, difficulty</w:t>
+              <w:t xml:space="preserve">Choose PvP or </w:t>
+            </w:r>
+            <w:proofErr w:type="spellStart"/>
+            <w:r>
+              <w:t>PvAI</w:t>
+            </w:r>
+            <w:proofErr w:type="spellEnd"/>
+            <w:r>
+              <w:t xml:space="preserve">, board </w:t>
+            </w:r>
+            <w:proofErr w:type="spellStart"/>
+            <w:r>
+              <w:t>color</w:t>
+            </w:r>
+            <w:proofErr w:type="spellEnd"/>
+            <w:r>
+              <w:t>, difficulty</w:t>
             </w:r>
           </w:p>
         </w:tc>
@@ -2543,8 +2559,13 @@
           </w:tcPr>
           <w:p>
             <w:r>
-              <w:t>Options include AI difficulty, timers, colors</w:t>
-            </w:r>
+              <w:t xml:space="preserve">Options include AI difficulty, timers, </w:t>
+            </w:r>
+            <w:proofErr w:type="spellStart"/>
+            <w:r>
+              <w:t>colors</w:t>
+            </w:r>
+            <w:proofErr w:type="spellEnd"/>
           </w:p>
         </w:tc>
       </w:tr>
@@ -3114,6 +3135,1187 @@
         </w:tc>
       </w:tr>
     </w:tbl>
+    <w:p/>
+    <w:p>
+      <w:pPr>
+        <w:pStyle w:val="Heading2"/>
+      </w:pPr>
+      <w:r>
+        <w:t>Class Descriptions</w:t>
+      </w:r>
+    </w:p>
+    <w:p>
+      <w:r>
+        <w:rPr>
+          <w:noProof/>
+        </w:rPr>
+        <w:drawing>
+          <wp:inline distT="0" distB="0" distL="0" distR="0" wp14:anchorId="2C2C9CC8" wp14:editId="4FA279BD">
+            <wp:extent cx="5724525" cy="3810000"/>
+            <wp:effectExtent l="0" t="0" r="9525" b="0"/>
+            <wp:docPr id="479202312" name="Picture 4"/>
+            <wp:cNvGraphicFramePr>
+              <a:graphicFrameLocks xmlns:a="http://schemas.openxmlformats.org/drawingml/2006/main" noChangeAspect="1"/>
+            </wp:cNvGraphicFramePr>
+            <a:graphic xmlns:a="http://schemas.openxmlformats.org/drawingml/2006/main">
+              <a:graphicData uri="http://schemas.openxmlformats.org/drawingml/2006/picture">
+                <pic:pic xmlns:pic="http://schemas.openxmlformats.org/drawingml/2006/picture">
+                  <pic:nvPicPr>
+                    <pic:cNvPr id="0" name="Picture 7"/>
+                    <pic:cNvPicPr>
+                      <a:picLocks noChangeAspect="1" noChangeArrowheads="1"/>
+                    </pic:cNvPicPr>
+                  </pic:nvPicPr>
+                  <pic:blipFill>
+                    <a:blip r:embed="rId11" cstate="print">
+                      <a:extLst>
+                        <a:ext uri="{28A0092B-C50C-407E-A947-70E740481C1C}">
+                          <a14:useLocalDpi xmlns:a14="http://schemas.microsoft.com/office/drawing/2010/main" val="0"/>
+                        </a:ext>
+                      </a:extLst>
+                    </a:blip>
+                    <a:srcRect/>
+                    <a:stretch>
+                      <a:fillRect/>
+                    </a:stretch>
+                  </pic:blipFill>
+                  <pic:spPr bwMode="auto">
+                    <a:xfrm>
+                      <a:off x="0" y="0"/>
+                      <a:ext cx="5724525" cy="3810000"/>
+                    </a:xfrm>
+                    <a:prstGeom prst="rect">
+                      <a:avLst/>
+                    </a:prstGeom>
+                    <a:noFill/>
+                    <a:ln>
+                      <a:noFill/>
+                    </a:ln>
+                  </pic:spPr>
+                </pic:pic>
+              </a:graphicData>
+            </a:graphic>
+          </wp:inline>
+        </w:drawing>
+      </w:r>
+    </w:p>
+    <w:p>
+      <w:r>
+        <w:t xml:space="preserve">The </w:t>
+      </w:r>
+      <w:r>
+        <w:rPr>
+          <w:b/>
+          <w:bCs/>
+        </w:rPr>
+        <w:t>Pieces</w:t>
+      </w:r>
+      <w:r>
+        <w:t xml:space="preserve"> class hierarchy was created to model the </w:t>
+      </w:r>
+      <w:r>
+        <w:rPr>
+          <w:b/>
+          <w:bCs/>
+        </w:rPr>
+        <w:t>individual behaviour of each chess piece</w:t>
+      </w:r>
+      <w:r>
+        <w:t xml:space="preserve"> using object-oriented principles. A base Piece class defines shared attributes such as colour, position, value, and movement status, while subclasses (Pawn, Rook, Knight, Bishop, Queen, King) implement piece-specific movement rules.</w:t>
+      </w:r>
+    </w:p>
+    <w:p>
+      <w:r>
+        <w:lastRenderedPageBreak/>
+        <w:t xml:space="preserve">This design allows movement logic to be </w:t>
+      </w:r>
+      <w:r>
+        <w:rPr>
+          <w:b/>
+          <w:bCs/>
+        </w:rPr>
+        <w:t>distributed across piece types</w:t>
+      </w:r>
+      <w:r>
+        <w:t>, rather than using large conditional structures inside the Board class. This improves readability, reduces code duplication, and aligns with real-world modelling, as each piece “knows” how it can move.</w:t>
+      </w:r>
+    </w:p>
+    <w:p>
+      <w:r>
+        <w:t xml:space="preserve">Using inheritance makes the system highly extensible. New piece types or rule variations can be added with minimal changes to existing code. It also allows the AI and Board classes to treat all pieces uniformly, calling the same methods regardless of piece type, which demonstrates </w:t>
+      </w:r>
+      <w:r>
+        <w:rPr>
+          <w:b/>
+          <w:bCs/>
+        </w:rPr>
+        <w:t>polymorphism</w:t>
+      </w:r>
+      <w:r>
+        <w:t xml:space="preserve"> in practice.</w:t>
+      </w:r>
+    </w:p>
+    <w:p>
+      <w:r>
+        <w:t>Board</w:t>
+      </w:r>
+    </w:p>
+    <w:p>
+      <w:r>
+        <w:rPr>
+          <w:noProof/>
+        </w:rPr>
+        <w:drawing>
+          <wp:inline distT="0" distB="0" distL="0" distR="0" wp14:anchorId="6531F061" wp14:editId="16265FFF">
+            <wp:extent cx="5724525" cy="3810000"/>
+            <wp:effectExtent l="0" t="0" r="9525" b="0"/>
+            <wp:docPr id="1986706239" name="Picture 6"/>
+            <wp:cNvGraphicFramePr>
+              <a:graphicFrameLocks xmlns:a="http://schemas.openxmlformats.org/drawingml/2006/main" noChangeAspect="1"/>
+            </wp:cNvGraphicFramePr>
+            <a:graphic xmlns:a="http://schemas.openxmlformats.org/drawingml/2006/main">
+              <a:graphicData uri="http://schemas.openxmlformats.org/drawingml/2006/picture">
+                <pic:pic xmlns:pic="http://schemas.openxmlformats.org/drawingml/2006/picture">
+                  <pic:nvPicPr>
+                    <pic:cNvPr id="0" name="Picture 9"/>
+                    <pic:cNvPicPr>
+                      <a:picLocks noChangeAspect="1" noChangeArrowheads="1"/>
+                    </pic:cNvPicPr>
+                  </pic:nvPicPr>
+                  <pic:blipFill>
+                    <a:blip r:embed="rId12" cstate="print">
+                      <a:extLst>
+                        <a:ext uri="{28A0092B-C50C-407E-A947-70E740481C1C}">
+                          <a14:useLocalDpi xmlns:a14="http://schemas.microsoft.com/office/drawing/2010/main" val="0"/>
+                        </a:ext>
+                      </a:extLst>
+                    </a:blip>
+                    <a:srcRect/>
+                    <a:stretch>
+                      <a:fillRect/>
+                    </a:stretch>
+                  </pic:blipFill>
+                  <pic:spPr bwMode="auto">
+                    <a:xfrm>
+                      <a:off x="0" y="0"/>
+                      <a:ext cx="5724525" cy="3810000"/>
+                    </a:xfrm>
+                    <a:prstGeom prst="rect">
+                      <a:avLst/>
+                    </a:prstGeom>
+                    <a:noFill/>
+                    <a:ln>
+                      <a:noFill/>
+                    </a:ln>
+                  </pic:spPr>
+                </pic:pic>
+              </a:graphicData>
+            </a:graphic>
+          </wp:inline>
+        </w:drawing>
+      </w:r>
+    </w:p>
+    <w:p>
+      <w:r>
+        <w:t xml:space="preserve">The </w:t>
+      </w:r>
+      <w:r>
+        <w:rPr>
+          <w:b/>
+          <w:bCs/>
+        </w:rPr>
+        <w:t>Board</w:t>
+      </w:r>
+      <w:r>
+        <w:t xml:space="preserve"> class was designed to represent the </w:t>
+      </w:r>
+      <w:r>
+        <w:rPr>
+          <w:b/>
+          <w:bCs/>
+        </w:rPr>
+        <w:t>current state of the chessboard</w:t>
+      </w:r>
+      <w:r>
+        <w:t xml:space="preserve"> at any point in time. It stores the positions of all pieces, manages movement on the board, and enforces chess rules such as check, checkmate, stalemate, and legal move validation.</w:t>
+      </w:r>
+    </w:p>
+    <w:p>
+      <w:r>
+        <w:t xml:space="preserve">Encapsulating this logic in a Board class allows all rule-related operations to be handled in one place. This includes determining whether a square is empty, checking if a move is within bounds, simulating moves on copied boards, and detecting attacks on the king. This approach improves </w:t>
+      </w:r>
+      <w:r>
+        <w:rPr>
+          <w:b/>
+          <w:bCs/>
+        </w:rPr>
+        <w:t>data integrity</w:t>
+      </w:r>
+      <w:r>
+        <w:t>, as only the Board class is responsible for modifying the board state.</w:t>
+      </w:r>
+    </w:p>
+    <w:p>
+      <w:r>
+        <w:t xml:space="preserve">The Board class also supports advanced functionality such as move simulation and deep copying, which is essential for implementing the minimax AI algorithm. By </w:t>
+      </w:r>
+      <w:r>
+        <w:lastRenderedPageBreak/>
+        <w:t>isolating rule enforcement from rendering and input handling, the system becomes more reliable and significantly easier to test.</w:t>
+      </w:r>
+    </w:p>
+    <w:p/>
+    <w:p>
+      <w:r>
+        <w:t>A pre-move method was considered, but since this is designed to be played locally or against AI , the pre-move capability may affect the current users turn as they share a mouse. And also processing of AI moves would have to be done non-locally to allow pre-moves to be made by player</w:t>
+      </w:r>
+    </w:p>
+    <w:p/>
+    <w:p>
+      <w:r>
+        <w:t>Game</w:t>
+      </w:r>
+      <w:r>
+        <w:rPr>
+          <w:noProof/>
+        </w:rPr>
+        <w:drawing>
+          <wp:inline distT="0" distB="0" distL="0" distR="0" wp14:anchorId="468691D7" wp14:editId="4C8CCCDD">
+            <wp:extent cx="5724525" cy="3810000"/>
+            <wp:effectExtent l="0" t="0" r="9525" b="0"/>
+            <wp:docPr id="806939374" name="Picture 1"/>
+            <wp:cNvGraphicFramePr>
+              <a:graphicFrameLocks xmlns:a="http://schemas.openxmlformats.org/drawingml/2006/main" noChangeAspect="1"/>
+            </wp:cNvGraphicFramePr>
+            <a:graphic xmlns:a="http://schemas.openxmlformats.org/drawingml/2006/main">
+              <a:graphicData uri="http://schemas.openxmlformats.org/drawingml/2006/picture">
+                <pic:pic xmlns:pic="http://schemas.openxmlformats.org/drawingml/2006/picture">
+                  <pic:nvPicPr>
+                    <pic:cNvPr id="0" name="Picture 1"/>
+                    <pic:cNvPicPr>
+                      <a:picLocks noChangeAspect="1" noChangeArrowheads="1"/>
+                    </pic:cNvPicPr>
+                  </pic:nvPicPr>
+                  <pic:blipFill>
+                    <a:blip r:embed="rId13" cstate="print">
+                      <a:extLst>
+                        <a:ext uri="{28A0092B-C50C-407E-A947-70E740481C1C}">
+                          <a14:useLocalDpi xmlns:a14="http://schemas.microsoft.com/office/drawing/2010/main" val="0"/>
+                        </a:ext>
+                      </a:extLst>
+                    </a:blip>
+                    <a:srcRect/>
+                    <a:stretch>
+                      <a:fillRect/>
+                    </a:stretch>
+                  </pic:blipFill>
+                  <pic:spPr bwMode="auto">
+                    <a:xfrm>
+                      <a:off x="0" y="0"/>
+                      <a:ext cx="5724525" cy="3810000"/>
+                    </a:xfrm>
+                    <a:prstGeom prst="rect">
+                      <a:avLst/>
+                    </a:prstGeom>
+                    <a:noFill/>
+                    <a:ln>
+                      <a:noFill/>
+                    </a:ln>
+                  </pic:spPr>
+                </pic:pic>
+              </a:graphicData>
+            </a:graphic>
+          </wp:inline>
+        </w:drawing>
+      </w:r>
+    </w:p>
+    <w:p>
+      <w:r>
+        <w:t xml:space="preserve">The </w:t>
+      </w:r>
+      <w:r>
+        <w:rPr>
+          <w:b/>
+          <w:bCs/>
+        </w:rPr>
+        <w:t>Game</w:t>
+      </w:r>
+      <w:r>
+        <w:t xml:space="preserve"> class was created to act as the </w:t>
+      </w:r>
+      <w:r>
+        <w:rPr>
+          <w:b/>
+          <w:bCs/>
+        </w:rPr>
+        <w:t>central controller</w:t>
+      </w:r>
+      <w:r>
+        <w:t xml:space="preserve"> of the chess system. Its primary purpose is to manage the overall game state and enforce the flow of play. This includes tracking whose turn it is, which piece (if any) is currently selected, handling user interactions, and coordinating communication between the board, the rendering system, and the AI.</w:t>
+      </w:r>
+    </w:p>
+    <w:p>
+      <w:r>
+        <w:t xml:space="preserve">By separating this logic into a Game class, the system follows the </w:t>
+      </w:r>
+      <w:r>
+        <w:rPr>
+          <w:b/>
+          <w:bCs/>
+        </w:rPr>
+        <w:t>separation of concerns</w:t>
+      </w:r>
+      <w:r>
+        <w:t xml:space="preserve"> principle. The Game class does not handle how the board is drawn or how individual pieces move internally; instead, it focuses on </w:t>
+      </w:r>
+      <w:r>
+        <w:rPr>
+          <w:i/>
+          <w:iCs/>
+        </w:rPr>
+        <w:t>when</w:t>
+      </w:r>
+      <w:r>
+        <w:t xml:space="preserve"> actions occur and </w:t>
+      </w:r>
+      <w:r>
+        <w:rPr>
+          <w:i/>
+          <w:iCs/>
+        </w:rPr>
+        <w:t>whether</w:t>
+      </w:r>
+      <w:r>
+        <w:t xml:space="preserve"> they are valid within the context of the game rules. This makes the program easier to maintain and extend, for example by adding features such as AI opponents, move history, or different game modes.</w:t>
+      </w:r>
+    </w:p>
+    <w:p>
+      <w:r>
+        <w:lastRenderedPageBreak/>
+        <w:t>This class also provides a single point of control for user input, ensuring that moves are only executed when they are legal and when it is the correct player’s turn.</w:t>
+      </w:r>
+    </w:p>
+    <w:p/>
+    <w:p>
+      <w:r>
+        <w:t>Rendering</w:t>
+      </w:r>
+    </w:p>
+    <w:p>
+      <w:r>
+        <w:rPr>
+          <w:noProof/>
+        </w:rPr>
+        <w:drawing>
+          <wp:inline distT="0" distB="0" distL="0" distR="0" wp14:anchorId="438E1DDD" wp14:editId="18A8B694">
+            <wp:extent cx="5724525" cy="3810000"/>
+            <wp:effectExtent l="0" t="0" r="9525" b="0"/>
+            <wp:docPr id="1681691295" name="Picture 2"/>
+            <wp:cNvGraphicFramePr>
+              <a:graphicFrameLocks xmlns:a="http://schemas.openxmlformats.org/drawingml/2006/main" noChangeAspect="1"/>
+            </wp:cNvGraphicFramePr>
+            <a:graphic xmlns:a="http://schemas.openxmlformats.org/drawingml/2006/main">
+              <a:graphicData uri="http://schemas.openxmlformats.org/drawingml/2006/picture">
+                <pic:pic xmlns:pic="http://schemas.openxmlformats.org/drawingml/2006/picture">
+                  <pic:nvPicPr>
+                    <pic:cNvPr id="0" name="Picture 2"/>
+                    <pic:cNvPicPr>
+                      <a:picLocks noChangeAspect="1" noChangeArrowheads="1"/>
+                    </pic:cNvPicPr>
+                  </pic:nvPicPr>
+                  <pic:blipFill>
+                    <a:blip r:embed="rId14" cstate="print">
+                      <a:extLst>
+                        <a:ext uri="{28A0092B-C50C-407E-A947-70E740481C1C}">
+                          <a14:useLocalDpi xmlns:a14="http://schemas.microsoft.com/office/drawing/2010/main" val="0"/>
+                        </a:ext>
+                      </a:extLst>
+                    </a:blip>
+                    <a:srcRect/>
+                    <a:stretch>
+                      <a:fillRect/>
+                    </a:stretch>
+                  </pic:blipFill>
+                  <pic:spPr bwMode="auto">
+                    <a:xfrm>
+                      <a:off x="0" y="0"/>
+                      <a:ext cx="5724525" cy="3810000"/>
+                    </a:xfrm>
+                    <a:prstGeom prst="rect">
+                      <a:avLst/>
+                    </a:prstGeom>
+                    <a:noFill/>
+                    <a:ln>
+                      <a:noFill/>
+                    </a:ln>
+                  </pic:spPr>
+                </pic:pic>
+              </a:graphicData>
+            </a:graphic>
+          </wp:inline>
+        </w:drawing>
+      </w:r>
+    </w:p>
+    <w:p>
+      <w:r>
+        <w:t xml:space="preserve">The </w:t>
+      </w:r>
+      <w:r>
+        <w:rPr>
+          <w:b/>
+          <w:bCs/>
+        </w:rPr>
+        <w:t>Rendering</w:t>
+      </w:r>
+      <w:r>
+        <w:t xml:space="preserve"> class was introduced to handle all </w:t>
+      </w:r>
+      <w:r>
+        <w:rPr>
+          <w:b/>
+          <w:bCs/>
+        </w:rPr>
+        <w:t>graphical output</w:t>
+      </w:r>
+      <w:r>
+        <w:t xml:space="preserve"> using a game library. Its responsibility is limited to drawing the board, pieces, highlights, menus, and visual feedback for the user.</w:t>
+      </w:r>
+    </w:p>
+    <w:p>
+      <w:r>
+        <w:t>Separating rendering logic from game logic ensures that visual updates do not interfere with rule enforcement or AI decision-making. This makes the program more modular and allows the game logic to be tested independently of the graphical interface.</w:t>
+      </w:r>
+    </w:p>
+    <w:p>
+      <w:r>
+        <w:t>This design also makes future changes easier. For example, the rendering system could be replaced or upgraded without affecting the core chess logic. This clear distinction between logic and presentation reflects professional software design practices and supports maintainability.</w:t>
+      </w:r>
+    </w:p>
+    <w:p/>
+    <w:p>
+      <w:pPr>
+        <w:pStyle w:val="Heading2"/>
+      </w:pPr>
+      <w:r>
+        <w:t>Description of Key algorithms</w:t>
+      </w:r>
+    </w:p>
+    <w:p/>
+    <w:p>
+      <w:pPr>
+        <w:pStyle w:val="Heading3"/>
+      </w:pPr>
+      <w:r>
+        <w:lastRenderedPageBreak/>
+        <w:t>Minimax algorithm with alpha-beta pruning</w:t>
+      </w:r>
+    </w:p>
+    <w:p>
+      <w:pPr>
+        <w:rPr>
+          <w:b/>
+          <w:bCs/>
+        </w:rPr>
+      </w:pPr>
+      <w:r>
+        <w:rPr>
+          <w:b/>
+          <w:bCs/>
+        </w:rPr>
+        <w:t>Description of key algorithms</w:t>
+      </w:r>
+    </w:p>
+    <w:p>
+      <w:pPr>
+        <w:rPr>
+          <w:b/>
+          <w:bCs/>
+        </w:rPr>
+      </w:pPr>
+      <w:r>
+        <w:rPr>
+          <w:b/>
+          <w:bCs/>
+        </w:rPr>
+        <w:t>AI move selection (Minimax algorithm)</w:t>
+      </w:r>
+    </w:p>
+    <w:p>
+      <w:r>
+        <w:t xml:space="preserve">The selection of moves for the computer-controlled opponent is achieved using the </w:t>
+      </w:r>
+      <w:r>
+        <w:rPr>
+          <w:b/>
+          <w:bCs/>
+        </w:rPr>
+        <w:t>minimax algorithm</w:t>
+      </w:r>
+      <w:r>
+        <w:t>, a decision-making algorithm commonly used in turn-based, two-player games with perfect information such as chess. The purpose of this algorithm is to determine the optimal move by assuming that both players will play as well as possible.</w:t>
+      </w:r>
+    </w:p>
+    <w:p>
+      <w:pPr>
+        <w:rPr>
+          <w:b/>
+          <w:bCs/>
+        </w:rPr>
+      </w:pPr>
+      <w:r>
+        <w:rPr>
+          <w:b/>
+          <w:bCs/>
+        </w:rPr>
+        <w:t>Overview of the minimax process</w:t>
+      </w:r>
+    </w:p>
+    <w:p>
+      <w:r>
+        <w:t xml:space="preserve">The minimax algorithm works by exploring a </w:t>
+      </w:r>
+      <w:r>
+        <w:rPr>
+          <w:b/>
+          <w:bCs/>
+        </w:rPr>
+        <w:t>game tree</w:t>
+      </w:r>
+      <w:r>
+        <w:t xml:space="preserve"> of possible future board states. Each node in the tree represents a board position, and each branch represents a legal move that can be made from that position. The algorithm alternates between two perspectives: a </w:t>
+      </w:r>
+      <w:r>
+        <w:rPr>
+          <w:b/>
+          <w:bCs/>
+        </w:rPr>
+        <w:t>maximising player</w:t>
+      </w:r>
+      <w:r>
+        <w:t xml:space="preserve">, which represents the AI attempting to maximise its advantage, and a </w:t>
+      </w:r>
+      <w:r>
+        <w:rPr>
+          <w:b/>
+          <w:bCs/>
+        </w:rPr>
+        <w:t>minimising player</w:t>
+      </w:r>
+      <w:r>
+        <w:t>, which represents the opponent attempting to minimise the AI’s advantage.</w:t>
+      </w:r>
+    </w:p>
+    <w:p>
+      <w:r>
+        <w:t>The algorithm operates recursively, simulating moves for both players up to a fixed depth. This depth represents how many moves ahead the AI will consider and is limited to ensure the algorithm runs efficiently.</w:t>
+      </w:r>
+    </w:p>
+    <w:p>
+      <w:r>
+        <w:pict w14:anchorId="3597C384">
+          <v:rect id="_x0000_i1079" style="width:0;height:1.5pt" o:hralign="center" o:hrstd="t" o:hr="t" fillcolor="#a0a0a0" stroked="f"/>
+        </w:pict>
+      </w:r>
+    </w:p>
+    <w:p>
+      <w:pPr>
+        <w:rPr>
+          <w:b/>
+          <w:bCs/>
+        </w:rPr>
+      </w:pPr>
+      <w:r>
+        <w:rPr>
+          <w:b/>
+          <w:bCs/>
+        </w:rPr>
+        <w:t>Evaluation of board states</w:t>
+      </w:r>
+    </w:p>
+    <w:p>
+      <w:r>
+        <w:t xml:space="preserve">When the algorithm reaches the specified depth limit or a terminal state such as checkmate or stalemate, it evaluates the board using a </w:t>
+      </w:r>
+      <w:r>
+        <w:rPr>
+          <w:b/>
+          <w:bCs/>
+        </w:rPr>
+        <w:t>heuristic evaluation function</w:t>
+      </w:r>
+      <w:r>
+        <w:t>. This function assigns a numerical score to the position based on the material balance of the board. Each piece is given a predefined value (for example, pawns are worth less than queens), and the total score is calculated by summing the values of the AI’s pieces and subtracting the values of the opponent’s pieces.</w:t>
+      </w:r>
+    </w:p>
+    <w:p>
+      <w:r>
+        <w:t>This evaluation provides an approximation of how favourable the position is for the AI without needing to calculate the entire game to completion.</w:t>
+      </w:r>
+    </w:p>
+    <w:p>
+      <w:r>
+        <w:pict w14:anchorId="1A3468D6">
+          <v:rect id="_x0000_i1080" style="width:0;height:1.5pt" o:hralign="center" o:hrstd="t" o:hr="t" fillcolor="#a0a0a0" stroked="f"/>
+        </w:pict>
+      </w:r>
+    </w:p>
+    <w:p>
+      <w:pPr>
+        <w:rPr>
+          <w:b/>
+          <w:bCs/>
+        </w:rPr>
+      </w:pPr>
+      <w:r>
+        <w:rPr>
+          <w:b/>
+          <w:bCs/>
+        </w:rPr>
+        <w:t>Recursive decision-making</w:t>
+      </w:r>
+    </w:p>
+    <w:p>
+      <w:r>
+        <w:t>Once a board state has been evaluated, the score is propagated back up the game tree. At each level:</w:t>
+      </w:r>
+    </w:p>
+    <w:p>
+      <w:pPr>
+        <w:numPr>
+          <w:ilvl w:val="0"/>
+          <w:numId w:val="10"/>
+        </w:numPr>
+      </w:pPr>
+      <w:r>
+        <w:t xml:space="preserve">The maximising player selects the move with the </w:t>
+      </w:r>
+      <w:r>
+        <w:rPr>
+          <w:b/>
+          <w:bCs/>
+        </w:rPr>
+        <w:t>highest score</w:t>
+      </w:r>
+    </w:p>
+    <w:p>
+      <w:pPr>
+        <w:numPr>
+          <w:ilvl w:val="0"/>
+          <w:numId w:val="10"/>
+        </w:numPr>
+      </w:pPr>
+      <w:r>
+        <w:t xml:space="preserve">The minimising player selects the move with the </w:t>
+      </w:r>
+      <w:r>
+        <w:rPr>
+          <w:b/>
+          <w:bCs/>
+        </w:rPr>
+        <w:t>lowest score</w:t>
+      </w:r>
+    </w:p>
+    <w:p>
+      <w:r>
+        <w:lastRenderedPageBreak/>
+        <w:t>By repeatedly applying this process, the algorithm ensures that the AI chooses the move that leads to the best possible outcome assuming optimal play from the opponent.</w:t>
+      </w:r>
+    </w:p>
+    <w:p>
+      <w:r>
+        <w:pict w14:anchorId="67A6A7F7">
+          <v:rect id="_x0000_i1081" style="width:0;height:1.5pt" o:hralign="center" o:hrstd="t" o:hr="t" fillcolor="#a0a0a0" stroked="f"/>
+        </w:pict>
+      </w:r>
+    </w:p>
+    <w:p>
+      <w:pPr>
+        <w:rPr>
+          <w:b/>
+          <w:bCs/>
+        </w:rPr>
+      </w:pPr>
+      <w:r>
+        <w:rPr>
+          <w:b/>
+          <w:bCs/>
+        </w:rPr>
+        <w:t>Optimisation using alpha–beta pruning</w:t>
+      </w:r>
+    </w:p>
+    <w:p>
+      <w:r>
+        <w:t xml:space="preserve">To improve efficiency, </w:t>
+      </w:r>
+      <w:r>
+        <w:rPr>
+          <w:b/>
+          <w:bCs/>
+        </w:rPr>
+        <w:t>alpha–beta pruning</w:t>
+      </w:r>
+      <w:r>
+        <w:t xml:space="preserve"> is incorporated into the minimax algorithm. This optimisation reduces the number of board states that need to be evaluated by eliminating branches of the game tree that cannot influence the final decision.</w:t>
+      </w:r>
+    </w:p>
+    <w:p>
+      <w:r>
+        <w:t>Two values are maintained during the search:</w:t>
+      </w:r>
+    </w:p>
+    <w:p>
+      <w:pPr>
+        <w:numPr>
+          <w:ilvl w:val="0"/>
+          <w:numId w:val="11"/>
+        </w:numPr>
+      </w:pPr>
+      <w:r>
+        <w:rPr>
+          <w:b/>
+          <w:bCs/>
+        </w:rPr>
+        <w:t>Alpha</w:t>
+      </w:r>
+      <w:r>
+        <w:t>, representing the best score the maximising player can guarantee</w:t>
+      </w:r>
+    </w:p>
+    <w:p>
+      <w:pPr>
+        <w:numPr>
+          <w:ilvl w:val="0"/>
+          <w:numId w:val="11"/>
+        </w:numPr>
+      </w:pPr>
+      <w:r>
+        <w:rPr>
+          <w:b/>
+          <w:bCs/>
+        </w:rPr>
+        <w:t>Beta</w:t>
+      </w:r>
+      <w:r>
+        <w:t>, representing the best score the minimising player can guarantee</w:t>
+      </w:r>
+    </w:p>
+    <w:p>
+      <w:r>
+        <w:t>If at any point beta becomes less than or equal to alpha, further exploration of that branch is abandoned. This significantly reduces the number of recursive calls made, improving performance while preserving the correctness of the result.</w:t>
+      </w:r>
+    </w:p>
+    <w:p/>
+    <w:p>
+      <w:pPr>
+        <w:pStyle w:val="Heading3"/>
+      </w:pPr>
+    </w:p>
+    <w:p>
+      <w:pPr>
+        <w:pStyle w:val="Heading2"/>
+      </w:pPr>
+      <w:r>
+        <w:t>Key data structures</w:t>
+      </w:r>
+    </w:p>
+    <w:p>
+      <w:pPr>
+        <w:rPr>
+          <w:b/>
+          <w:bCs/>
+        </w:rPr>
+      </w:pPr>
+      <w:r>
+        <w:rPr>
+          <w:b/>
+          <w:bCs/>
+        </w:rPr>
+        <w:t>Description of key data structures</w:t>
+      </w:r>
+    </w:p>
+    <w:p>
+      <w:r>
+        <w:t>The chess system relies on several interrelated data structures to accurately represent the game state, enforce rules, and support AI decision-making. These data structures were chosen to balance clarity, efficiency, and suitability for modelling a complex, rule-based system.</w:t>
+      </w:r>
+    </w:p>
+    <w:p>
+      <w:r>
+        <w:pict w14:anchorId="65A5126F">
+          <v:rect id="_x0000_i1127" style="width:0;height:1.5pt" o:hralign="center" o:hrstd="t" o:hr="t" fillcolor="#a0a0a0" stroked="f"/>
+        </w:pict>
+      </w:r>
+    </w:p>
+    <w:p>
+      <w:pPr>
+        <w:rPr>
+          <w:b/>
+          <w:bCs/>
+        </w:rPr>
+      </w:pPr>
+      <w:r>
+        <w:rPr>
+          <w:b/>
+          <w:bCs/>
+        </w:rPr>
+        <w:t>Two-dimensional array representation of the board</w:t>
+      </w:r>
+    </w:p>
+    <w:p>
+      <w:r>
+        <w:t xml:space="preserve">The chessboard is represented using a </w:t>
+      </w:r>
+      <w:r>
+        <w:rPr>
+          <w:b/>
+          <w:bCs/>
+        </w:rPr>
+        <w:t>two-dimensional array (8×8 grid)</w:t>
+      </w:r>
+      <w:r>
+        <w:t>, where each element corresponds to a square on the board. Each position in the array either contains a reference to a Piece object or a null value if the square is empty.</w:t>
+      </w:r>
+    </w:p>
+    <w:p>
+      <w:r>
+        <w:t>This structure was chosen because it closely mirrors the real-world layout of a chessboard, making it intuitive to work with. Accessing a square by its row and column index allows constant-time access, which is essential for checking move validity, detecting collisions, and evaluating board states.</w:t>
+      </w:r>
+    </w:p>
+    <w:p>
+      <w:r>
+        <w:lastRenderedPageBreak/>
+        <w:t>The grid structure is used extensively throughout the program, including move generation, check detection, AI simulation, and rendering. Its fixed size ensures predictable memory usage and simplifies bounds checking.</w:t>
+      </w:r>
+    </w:p>
+    <w:p>
+      <w:r>
+        <w:pict w14:anchorId="08C1117B">
+          <v:rect id="_x0000_i1128" style="width:0;height:1.5pt" o:hralign="center" o:hrstd="t" o:hr="t" fillcolor="#a0a0a0" stroked="f"/>
+        </w:pict>
+      </w:r>
+    </w:p>
+    <w:p>
+      <w:pPr>
+        <w:rPr>
+          <w:b/>
+          <w:bCs/>
+        </w:rPr>
+      </w:pPr>
+      <w:r>
+        <w:rPr>
+          <w:b/>
+          <w:bCs/>
+        </w:rPr>
+        <w:t>Piece objects stored within the board grid</w:t>
+      </w:r>
+    </w:p>
+    <w:p>
+      <w:r>
+        <w:t xml:space="preserve">Each chess piece is represented as an </w:t>
+      </w:r>
+      <w:r>
+        <w:rPr>
+          <w:b/>
+          <w:bCs/>
+        </w:rPr>
+        <w:t>object</w:t>
+      </w:r>
+      <w:r>
+        <w:t>, with attributes such as type, colour, position, and movement state. These objects are stored directly inside the board’s two-dimensional array rather than using separate lists or identifiers.</w:t>
+      </w:r>
+    </w:p>
+    <w:p>
+      <w:r>
+        <w:t>This approach allows each piece to encapsulate its own behaviour, particularly its movement rules, while still being accessible through the board structure. By storing objects rather than primitive values, the system can easily query piece-specific information without complex lookups or conditionals.</w:t>
+      </w:r>
+    </w:p>
+    <w:p>
+      <w:r>
+        <w:t xml:space="preserve">This design demonstrates effective use of </w:t>
+      </w:r>
+      <w:r>
+        <w:rPr>
+          <w:b/>
+          <w:bCs/>
+        </w:rPr>
+        <w:t>object-oriented data modelling</w:t>
+      </w:r>
+      <w:r>
+        <w:t>, where data and behaviour are combined within a single structure.</w:t>
+      </w:r>
+    </w:p>
+    <w:p>
+      <w:r>
+        <w:pict w14:anchorId="71C85766">
+          <v:rect id="_x0000_i1129" style="width:0;height:1.5pt" o:hralign="center" o:hrstd="t" o:hr="t" fillcolor="#a0a0a0" stroked="f"/>
+        </w:pict>
+      </w:r>
+    </w:p>
+    <w:p>
+      <w:pPr>
+        <w:rPr>
+          <w:b/>
+          <w:bCs/>
+        </w:rPr>
+      </w:pPr>
+      <w:r>
+        <w:rPr>
+          <w:b/>
+          <w:bCs/>
+        </w:rPr>
+        <w:t>Lists for move generation and legal move storage</w:t>
+      </w:r>
+    </w:p>
+    <w:p>
+      <w:r>
+        <w:rPr>
+          <w:b/>
+          <w:bCs/>
+        </w:rPr>
+        <w:t>Lists</w:t>
+      </w:r>
+      <w:r>
+        <w:t xml:space="preserve"> are used to store collections of possible moves for individual pieces. For each piece, pseudo-legal moves are generated and stored in a list before being filtered into a list of fully legal moves.</w:t>
+      </w:r>
+    </w:p>
+    <w:p>
+      <w:r>
+        <w:t>Lists were chosen because:</w:t>
+      </w:r>
+    </w:p>
+    <w:p>
+      <w:pPr>
+        <w:numPr>
+          <w:ilvl w:val="0"/>
+          <w:numId w:val="12"/>
+        </w:numPr>
+      </w:pPr>
+      <w:r>
+        <w:t>The number of moves per piece is small and variable</w:t>
+      </w:r>
+    </w:p>
+    <w:p>
+      <w:pPr>
+        <w:numPr>
+          <w:ilvl w:val="0"/>
+          <w:numId w:val="12"/>
+        </w:numPr>
+      </w:pPr>
+      <w:r>
+        <w:t>Order is not critical</w:t>
+      </w:r>
+    </w:p>
+    <w:p>
+      <w:pPr>
+        <w:numPr>
+          <w:ilvl w:val="0"/>
+          <w:numId w:val="12"/>
+        </w:numPr>
+      </w:pPr>
+      <w:r>
+        <w:t>Iteration is frequent and efficient</w:t>
+      </w:r>
+    </w:p>
+    <w:p>
+      <w:r>
+        <w:t>These lists are regenerated dynamically each time a piece is selected or evaluated by the AI, ensuring the move data is always accurate and reflects the current board state.</w:t>
+      </w:r>
+    </w:p>
+    <w:p>
+      <w:r>
+        <w:pict w14:anchorId="2DCDDB58">
+          <v:rect id="_x0000_i1130" style="width:0;height:1.5pt" o:hralign="center" o:hrstd="t" o:hr="t" fillcolor="#a0a0a0" stroked="f"/>
+        </w:pict>
+      </w:r>
+    </w:p>
+    <w:p>
+      <w:pPr>
+        <w:rPr>
+          <w:b/>
+          <w:bCs/>
+        </w:rPr>
+      </w:pPr>
+      <w:r>
+        <w:rPr>
+          <w:b/>
+          <w:bCs/>
+        </w:rPr>
+        <w:t>Dictionary for mapping pieces to legal moves</w:t>
+      </w:r>
+    </w:p>
+    <w:p>
+      <w:r>
+        <w:t xml:space="preserve">In situations where all legal moves for a player are required, such as checkmate detection or AI search, a </w:t>
+      </w:r>
+      <w:r>
+        <w:rPr>
+          <w:b/>
+          <w:bCs/>
+        </w:rPr>
+        <w:t>dictionary</w:t>
+      </w:r>
+      <w:r>
+        <w:t xml:space="preserve"> is used. In this structure:</w:t>
+      </w:r>
+    </w:p>
+    <w:p>
+      <w:pPr>
+        <w:numPr>
+          <w:ilvl w:val="0"/>
+          <w:numId w:val="13"/>
+        </w:numPr>
+      </w:pPr>
+      <w:r>
+        <w:t>Keys represent the starting position of a piece</w:t>
+      </w:r>
+    </w:p>
+    <w:p>
+      <w:pPr>
+        <w:numPr>
+          <w:ilvl w:val="0"/>
+          <w:numId w:val="13"/>
+        </w:numPr>
+      </w:pPr>
+      <w:r>
+        <w:t>Values are lists of legal destination squares for that piece</w:t>
+      </w:r>
+    </w:p>
+    <w:p>
+      <w:r>
+        <w:lastRenderedPageBreak/>
+        <w:t>This structure allows efficient grouping of moves by piece and supports algorithms that need to iterate through all possible actions available to a player. It also improves readability and organisation when working with large sets of moves.</w:t>
+      </w:r>
+    </w:p>
+    <w:p>
+      <w:r>
+        <w:pict w14:anchorId="4D64790A">
+          <v:rect id="_x0000_i1131" style="width:0;height:1.5pt" o:hralign="center" o:hrstd="t" o:hr="t" fillcolor="#a0a0a0" stroked="f"/>
+        </w:pict>
+      </w:r>
+    </w:p>
+    <w:p>
+      <w:pPr>
+        <w:rPr>
+          <w:b/>
+          <w:bCs/>
+        </w:rPr>
+      </w:pPr>
+      <w:r>
+        <w:rPr>
+          <w:b/>
+          <w:bCs/>
+        </w:rPr>
+        <w:t>Tuples for board positions</w:t>
+      </w:r>
+    </w:p>
+    <w:p>
+      <w:r>
+        <w:t xml:space="preserve">Board positions are represented using </w:t>
+      </w:r>
+      <w:r>
+        <w:rPr>
+          <w:b/>
+          <w:bCs/>
+        </w:rPr>
+        <w:t>tuples of the form (row, column)</w:t>
+      </w:r>
+      <w:r>
+        <w:t>. Tuples were chosen because they are immutable, lightweight, and suitable for representing fixed coordinate pairs.</w:t>
+      </w:r>
+    </w:p>
+    <w:p>
+      <w:r>
+        <w:t>Using tuples ensures that positions cannot be accidentally modified during processing and allows them to be safely used as dictionary keys when required. This contributes to data integrity and reduces the risk of subtle bugs.</w:t>
+      </w:r>
+    </w:p>
+    <w:p>
+      <w:r>
+        <w:pict w14:anchorId="228445B5">
+          <v:rect id="_x0000_i1132" style="width:0;height:1.5pt" o:hralign="center" o:hrstd="t" o:hr="t" fillcolor="#a0a0a0" stroked="f"/>
+        </w:pict>
+      </w:r>
+    </w:p>
+    <w:p>
+      <w:pPr>
+        <w:rPr>
+          <w:b/>
+          <w:bCs/>
+        </w:rPr>
+      </w:pPr>
+      <w:r>
+        <w:rPr>
+          <w:b/>
+          <w:bCs/>
+        </w:rPr>
+        <w:t>Deep copies of board states for AI simulation</w:t>
+      </w:r>
+    </w:p>
+    <w:p>
+      <w:r>
+        <w:t xml:space="preserve">To support the minimax algorithm, the system frequently creates </w:t>
+      </w:r>
+      <w:r>
+        <w:rPr>
+          <w:b/>
+          <w:bCs/>
+        </w:rPr>
+        <w:t>deep copies of the board</w:t>
+      </w:r>
+      <w:r>
+        <w:t>. Each copy represents an independent game state resulting from a simulated move.</w:t>
+      </w:r>
+    </w:p>
+    <w:p>
+      <w:r>
+        <w:t>This ensures that hypothetical moves explored by the AI do not alter the actual game state. The copied boards maintain their own independent grids and piece objects, allowing safe recursive evaluation of future positions.</w:t>
+      </w:r>
+    </w:p>
+    <w:p>
+      <w:r>
+        <w:t>This data handling strategy is essential for correctness in recursive algorithms and demonstrates controlled use of memory to preserve program state.</w:t>
+      </w:r>
+    </w:p>
+    <w:p>
+      <w:r>
+        <w:pict w14:anchorId="4772F8C3">
+          <v:rect id="_x0000_i1133" style="width:0;height:1.5pt" o:hralign="center" o:hrstd="t" o:hr="t" fillcolor="#a0a0a0" stroked="f"/>
+        </w:pict>
+      </w:r>
+    </w:p>
+    <w:p>
+      <w:pPr>
+        <w:rPr>
+          <w:b/>
+          <w:bCs/>
+        </w:rPr>
+      </w:pPr>
+      <w:r>
+        <w:rPr>
+          <w:b/>
+          <w:bCs/>
+        </w:rPr>
+        <w:t>Stack-based recursion in minimax</w:t>
+      </w:r>
+    </w:p>
+    <w:p>
+      <w:r>
+        <w:t xml:space="preserve">Although not an explicit data structure in code, the minimax algorithm relies on the </w:t>
+      </w:r>
+      <w:r>
+        <w:rPr>
+          <w:b/>
+          <w:bCs/>
+        </w:rPr>
+        <w:t>call stack</w:t>
+      </w:r>
+      <w:r>
+        <w:t xml:space="preserve"> to manage recursive exploration of the game tree. Each recursive call represents a deeper level in the tree, storing local variables such as the board state, depth, and evaluation values.</w:t>
+      </w:r>
+    </w:p>
+    <w:p>
+      <w:r>
+        <w:t>This implicit use of a stack enables depth-first traversal of the game tree and is fundamental to how the algorithm operates.</w:t>
+      </w:r>
+    </w:p>
     <w:p/>
     <w:sectPr>
       <w:pgSz w:w="11906" w:h="16838"/>
@@ -3214,6 +4416,155 @@
     </w:lvl>
   </w:abstractNum>
   <w:abstractNum w:abstractNumId="1" w15:restartNumberingAfterBreak="0">
+    <w:nsid w:val="263031CA"/>
+    <w:multiLevelType w:val="multilevel"/>
+    <w:tmpl w:val="9DAEB5DE"/>
+    <w:lvl w:ilvl="0">
+      <w:start w:val="1"/>
+      <w:numFmt w:val="bullet"/>
+      <w:lvlText w:val=""/>
+      <w:lvlJc w:val="left"/>
+      <w:pPr>
+        <w:tabs>
+          <w:tab w:val="num" w:pos="720"/>
+        </w:tabs>
+        <w:ind w:left="720" w:hanging="360"/>
+      </w:pPr>
+      <w:rPr>
+        <w:rFonts w:ascii="Symbol" w:hAnsi="Symbol" w:hint="default"/>
+        <w:sz w:val="20"/>
+      </w:rPr>
+    </w:lvl>
+    <w:lvl w:ilvl="1" w:tentative="1">
+      <w:start w:val="1"/>
+      <w:numFmt w:val="bullet"/>
+      <w:lvlText w:val="o"/>
+      <w:lvlJc w:val="left"/>
+      <w:pPr>
+        <w:tabs>
+          <w:tab w:val="num" w:pos="1440"/>
+        </w:tabs>
+        <w:ind w:left="1440" w:hanging="360"/>
+      </w:pPr>
+      <w:rPr>
+        <w:rFonts w:ascii="Courier New" w:hAnsi="Courier New" w:hint="default"/>
+        <w:sz w:val="20"/>
+      </w:rPr>
+    </w:lvl>
+    <w:lvl w:ilvl="2" w:tentative="1">
+      <w:start w:val="1"/>
+      <w:numFmt w:val="bullet"/>
+      <w:lvlText w:val=""/>
+      <w:lvlJc w:val="left"/>
+      <w:pPr>
+        <w:tabs>
+          <w:tab w:val="num" w:pos="2160"/>
+        </w:tabs>
+        <w:ind w:left="2160" w:hanging="360"/>
+      </w:pPr>
+      <w:rPr>
+        <w:rFonts w:ascii="Wingdings" w:hAnsi="Wingdings" w:hint="default"/>
+        <w:sz w:val="20"/>
+      </w:rPr>
+    </w:lvl>
+    <w:lvl w:ilvl="3" w:tentative="1">
+      <w:start w:val="1"/>
+      <w:numFmt w:val="bullet"/>
+      <w:lvlText w:val=""/>
+      <w:lvlJc w:val="left"/>
+      <w:pPr>
+        <w:tabs>
+          <w:tab w:val="num" w:pos="2880"/>
+        </w:tabs>
+        <w:ind w:left="2880" w:hanging="360"/>
+      </w:pPr>
+      <w:rPr>
+        <w:rFonts w:ascii="Wingdings" w:hAnsi="Wingdings" w:hint="default"/>
+        <w:sz w:val="20"/>
+      </w:rPr>
+    </w:lvl>
+    <w:lvl w:ilvl="4" w:tentative="1">
+      <w:start w:val="1"/>
+      <w:numFmt w:val="bullet"/>
+      <w:lvlText w:val=""/>
+      <w:lvlJc w:val="left"/>
+      <w:pPr>
+        <w:tabs>
+          <w:tab w:val="num" w:pos="3600"/>
+        </w:tabs>
+        <w:ind w:left="3600" w:hanging="360"/>
+      </w:pPr>
+      <w:rPr>
+        <w:rFonts w:ascii="Wingdings" w:hAnsi="Wingdings" w:hint="default"/>
+        <w:sz w:val="20"/>
+      </w:rPr>
+    </w:lvl>
+    <w:lvl w:ilvl="5" w:tentative="1">
+      <w:start w:val="1"/>
+      <w:numFmt w:val="bullet"/>
+      <w:lvlText w:val=""/>
+      <w:lvlJc w:val="left"/>
+      <w:pPr>
+        <w:tabs>
+          <w:tab w:val="num" w:pos="4320"/>
+        </w:tabs>
+        <w:ind w:left="4320" w:hanging="360"/>
+      </w:pPr>
+      <w:rPr>
+        <w:rFonts w:ascii="Wingdings" w:hAnsi="Wingdings" w:hint="default"/>
+        <w:sz w:val="20"/>
+      </w:rPr>
+    </w:lvl>
+    <w:lvl w:ilvl="6" w:tentative="1">
+      <w:start w:val="1"/>
+      <w:numFmt w:val="bullet"/>
+      <w:lvlText w:val=""/>
+      <w:lvlJc w:val="left"/>
+      <w:pPr>
+        <w:tabs>
+          <w:tab w:val="num" w:pos="5040"/>
+        </w:tabs>
+        <w:ind w:left="5040" w:hanging="360"/>
+      </w:pPr>
+      <w:rPr>
+        <w:rFonts w:ascii="Wingdings" w:hAnsi="Wingdings" w:hint="default"/>
+        <w:sz w:val="20"/>
+      </w:rPr>
+    </w:lvl>
+    <w:lvl w:ilvl="7" w:tentative="1">
+      <w:start w:val="1"/>
+      <w:numFmt w:val="bullet"/>
+      <w:lvlText w:val=""/>
+      <w:lvlJc w:val="left"/>
+      <w:pPr>
+        <w:tabs>
+          <w:tab w:val="num" w:pos="5760"/>
+        </w:tabs>
+        <w:ind w:left="5760" w:hanging="360"/>
+      </w:pPr>
+      <w:rPr>
+        <w:rFonts w:ascii="Wingdings" w:hAnsi="Wingdings" w:hint="default"/>
+        <w:sz w:val="20"/>
+      </w:rPr>
+    </w:lvl>
+    <w:lvl w:ilvl="8" w:tentative="1">
+      <w:start w:val="1"/>
+      <w:numFmt w:val="bullet"/>
+      <w:lvlText w:val=""/>
+      <w:lvlJc w:val="left"/>
+      <w:pPr>
+        <w:tabs>
+          <w:tab w:val="num" w:pos="6480"/>
+        </w:tabs>
+        <w:ind w:left="6480" w:hanging="360"/>
+      </w:pPr>
+      <w:rPr>
+        <w:rFonts w:ascii="Wingdings" w:hAnsi="Wingdings" w:hint="default"/>
+        <w:sz w:val="20"/>
+      </w:rPr>
+    </w:lvl>
+  </w:abstractNum>
+  <w:abstractNum w:abstractNumId="2" w15:restartNumberingAfterBreak="0">
     <w:nsid w:val="2F0F1116"/>
     <w:multiLevelType w:val="hybridMultilevel"/>
     <w:tmpl w:val="534284A6"/>
@@ -3302,7 +4653,156 @@
       </w:pPr>
     </w:lvl>
   </w:abstractNum>
-  <w:abstractNum w:abstractNumId="2" w15:restartNumberingAfterBreak="0">
+  <w:abstractNum w:abstractNumId="3" w15:restartNumberingAfterBreak="0">
+    <w:nsid w:val="4CDE28E4"/>
+    <w:multiLevelType w:val="multilevel"/>
+    <w:tmpl w:val="D59A1634"/>
+    <w:lvl w:ilvl="0">
+      <w:start w:val="1"/>
+      <w:numFmt w:val="bullet"/>
+      <w:lvlText w:val=""/>
+      <w:lvlJc w:val="left"/>
+      <w:pPr>
+        <w:tabs>
+          <w:tab w:val="num" w:pos="720"/>
+        </w:tabs>
+        <w:ind w:left="720" w:hanging="360"/>
+      </w:pPr>
+      <w:rPr>
+        <w:rFonts w:ascii="Symbol" w:hAnsi="Symbol" w:hint="default"/>
+        <w:sz w:val="20"/>
+      </w:rPr>
+    </w:lvl>
+    <w:lvl w:ilvl="1" w:tentative="1">
+      <w:start w:val="1"/>
+      <w:numFmt w:val="bullet"/>
+      <w:lvlText w:val="o"/>
+      <w:lvlJc w:val="left"/>
+      <w:pPr>
+        <w:tabs>
+          <w:tab w:val="num" w:pos="1440"/>
+        </w:tabs>
+        <w:ind w:left="1440" w:hanging="360"/>
+      </w:pPr>
+      <w:rPr>
+        <w:rFonts w:ascii="Courier New" w:hAnsi="Courier New" w:hint="default"/>
+        <w:sz w:val="20"/>
+      </w:rPr>
+    </w:lvl>
+    <w:lvl w:ilvl="2" w:tentative="1">
+      <w:start w:val="1"/>
+      <w:numFmt w:val="bullet"/>
+      <w:lvlText w:val=""/>
+      <w:lvlJc w:val="left"/>
+      <w:pPr>
+        <w:tabs>
+          <w:tab w:val="num" w:pos="2160"/>
+        </w:tabs>
+        <w:ind w:left="2160" w:hanging="360"/>
+      </w:pPr>
+      <w:rPr>
+        <w:rFonts w:ascii="Wingdings" w:hAnsi="Wingdings" w:hint="default"/>
+        <w:sz w:val="20"/>
+      </w:rPr>
+    </w:lvl>
+    <w:lvl w:ilvl="3" w:tentative="1">
+      <w:start w:val="1"/>
+      <w:numFmt w:val="bullet"/>
+      <w:lvlText w:val=""/>
+      <w:lvlJc w:val="left"/>
+      <w:pPr>
+        <w:tabs>
+          <w:tab w:val="num" w:pos="2880"/>
+        </w:tabs>
+        <w:ind w:left="2880" w:hanging="360"/>
+      </w:pPr>
+      <w:rPr>
+        <w:rFonts w:ascii="Wingdings" w:hAnsi="Wingdings" w:hint="default"/>
+        <w:sz w:val="20"/>
+      </w:rPr>
+    </w:lvl>
+    <w:lvl w:ilvl="4" w:tentative="1">
+      <w:start w:val="1"/>
+      <w:numFmt w:val="bullet"/>
+      <w:lvlText w:val=""/>
+      <w:lvlJc w:val="left"/>
+      <w:pPr>
+        <w:tabs>
+          <w:tab w:val="num" w:pos="3600"/>
+        </w:tabs>
+        <w:ind w:left="3600" w:hanging="360"/>
+      </w:pPr>
+      <w:rPr>
+        <w:rFonts w:ascii="Wingdings" w:hAnsi="Wingdings" w:hint="default"/>
+        <w:sz w:val="20"/>
+      </w:rPr>
+    </w:lvl>
+    <w:lvl w:ilvl="5" w:tentative="1">
+      <w:start w:val="1"/>
+      <w:numFmt w:val="bullet"/>
+      <w:lvlText w:val=""/>
+      <w:lvlJc w:val="left"/>
+      <w:pPr>
+        <w:tabs>
+          <w:tab w:val="num" w:pos="4320"/>
+        </w:tabs>
+        <w:ind w:left="4320" w:hanging="360"/>
+      </w:pPr>
+      <w:rPr>
+        <w:rFonts w:ascii="Wingdings" w:hAnsi="Wingdings" w:hint="default"/>
+        <w:sz w:val="20"/>
+      </w:rPr>
+    </w:lvl>
+    <w:lvl w:ilvl="6" w:tentative="1">
+      <w:start w:val="1"/>
+      <w:numFmt w:val="bullet"/>
+      <w:lvlText w:val=""/>
+      <w:lvlJc w:val="left"/>
+      <w:pPr>
+        <w:tabs>
+          <w:tab w:val="num" w:pos="5040"/>
+        </w:tabs>
+        <w:ind w:left="5040" w:hanging="360"/>
+      </w:pPr>
+      <w:rPr>
+        <w:rFonts w:ascii="Wingdings" w:hAnsi="Wingdings" w:hint="default"/>
+        <w:sz w:val="20"/>
+      </w:rPr>
+    </w:lvl>
+    <w:lvl w:ilvl="7" w:tentative="1">
+      <w:start w:val="1"/>
+      <w:numFmt w:val="bullet"/>
+      <w:lvlText w:val=""/>
+      <w:lvlJc w:val="left"/>
+      <w:pPr>
+        <w:tabs>
+          <w:tab w:val="num" w:pos="5760"/>
+        </w:tabs>
+        <w:ind w:left="5760" w:hanging="360"/>
+      </w:pPr>
+      <w:rPr>
+        <w:rFonts w:ascii="Wingdings" w:hAnsi="Wingdings" w:hint="default"/>
+        <w:sz w:val="20"/>
+      </w:rPr>
+    </w:lvl>
+    <w:lvl w:ilvl="8" w:tentative="1">
+      <w:start w:val="1"/>
+      <w:numFmt w:val="bullet"/>
+      <w:lvlText w:val=""/>
+      <w:lvlJc w:val="left"/>
+      <w:pPr>
+        <w:tabs>
+          <w:tab w:val="num" w:pos="6480"/>
+        </w:tabs>
+        <w:ind w:left="6480" w:hanging="360"/>
+      </w:pPr>
+      <w:rPr>
+        <w:rFonts w:ascii="Wingdings" w:hAnsi="Wingdings" w:hint="default"/>
+        <w:sz w:val="20"/>
+      </w:rPr>
+    </w:lvl>
+  </w:abstractNum>
+  <w:abstractNum w:abstractNumId="4" w15:restartNumberingAfterBreak="0">
     <w:nsid w:val="4DC30221"/>
     <w:multiLevelType w:val="hybridMultilevel"/>
     <w:tmpl w:val="B1B4CCBC"/>
@@ -3391,7 +4891,7 @@
       </w:pPr>
     </w:lvl>
   </w:abstractNum>
-  <w:abstractNum w:abstractNumId="3" w15:restartNumberingAfterBreak="0">
+  <w:abstractNum w:abstractNumId="5" w15:restartNumberingAfterBreak="0">
     <w:nsid w:val="50BE4467"/>
     <w:multiLevelType w:val="hybridMultilevel"/>
     <w:tmpl w:val="7742AEB6"/>
@@ -3480,7 +4980,7 @@
       </w:pPr>
     </w:lvl>
   </w:abstractNum>
-  <w:abstractNum w:abstractNumId="4" w15:restartNumberingAfterBreak="0">
+  <w:abstractNum w:abstractNumId="6" w15:restartNumberingAfterBreak="0">
     <w:nsid w:val="5F5A5CF2"/>
     <w:multiLevelType w:val="hybridMultilevel"/>
     <w:tmpl w:val="AF0293BC"/>
@@ -3593,7 +5093,305 @@
       </w:rPr>
     </w:lvl>
   </w:abstractNum>
-  <w:abstractNum w:abstractNumId="5" w15:restartNumberingAfterBreak="0">
+  <w:abstractNum w:abstractNumId="7" w15:restartNumberingAfterBreak="0">
+    <w:nsid w:val="64F85C75"/>
+    <w:multiLevelType w:val="multilevel"/>
+    <w:tmpl w:val="5FA23E18"/>
+    <w:lvl w:ilvl="0">
+      <w:start w:val="1"/>
+      <w:numFmt w:val="bullet"/>
+      <w:lvlText w:val=""/>
+      <w:lvlJc w:val="left"/>
+      <w:pPr>
+        <w:tabs>
+          <w:tab w:val="num" w:pos="720"/>
+        </w:tabs>
+        <w:ind w:left="720" w:hanging="360"/>
+      </w:pPr>
+      <w:rPr>
+        <w:rFonts w:ascii="Symbol" w:hAnsi="Symbol" w:hint="default"/>
+        <w:sz w:val="20"/>
+      </w:rPr>
+    </w:lvl>
+    <w:lvl w:ilvl="1" w:tentative="1">
+      <w:start w:val="1"/>
+      <w:numFmt w:val="bullet"/>
+      <w:lvlText w:val="o"/>
+      <w:lvlJc w:val="left"/>
+      <w:pPr>
+        <w:tabs>
+          <w:tab w:val="num" w:pos="1440"/>
+        </w:tabs>
+        <w:ind w:left="1440" w:hanging="360"/>
+      </w:pPr>
+      <w:rPr>
+        <w:rFonts w:ascii="Courier New" w:hAnsi="Courier New" w:hint="default"/>
+        <w:sz w:val="20"/>
+      </w:rPr>
+    </w:lvl>
+    <w:lvl w:ilvl="2" w:tentative="1">
+      <w:start w:val="1"/>
+      <w:numFmt w:val="bullet"/>
+      <w:lvlText w:val=""/>
+      <w:lvlJc w:val="left"/>
+      <w:pPr>
+        <w:tabs>
+          <w:tab w:val="num" w:pos="2160"/>
+        </w:tabs>
+        <w:ind w:left="2160" w:hanging="360"/>
+      </w:pPr>
+      <w:rPr>
+        <w:rFonts w:ascii="Wingdings" w:hAnsi="Wingdings" w:hint="default"/>
+        <w:sz w:val="20"/>
+      </w:rPr>
+    </w:lvl>
+    <w:lvl w:ilvl="3" w:tentative="1">
+      <w:start w:val="1"/>
+      <w:numFmt w:val="bullet"/>
+      <w:lvlText w:val=""/>
+      <w:lvlJc w:val="left"/>
+      <w:pPr>
+        <w:tabs>
+          <w:tab w:val="num" w:pos="2880"/>
+        </w:tabs>
+        <w:ind w:left="2880" w:hanging="360"/>
+      </w:pPr>
+      <w:rPr>
+        <w:rFonts w:ascii="Wingdings" w:hAnsi="Wingdings" w:hint="default"/>
+        <w:sz w:val="20"/>
+      </w:rPr>
+    </w:lvl>
+    <w:lvl w:ilvl="4" w:tentative="1">
+      <w:start w:val="1"/>
+      <w:numFmt w:val="bullet"/>
+      <w:lvlText w:val=""/>
+      <w:lvlJc w:val="left"/>
+      <w:pPr>
+        <w:tabs>
+          <w:tab w:val="num" w:pos="3600"/>
+        </w:tabs>
+        <w:ind w:left="3600" w:hanging="360"/>
+      </w:pPr>
+      <w:rPr>
+        <w:rFonts w:ascii="Wingdings" w:hAnsi="Wingdings" w:hint="default"/>
+        <w:sz w:val="20"/>
+      </w:rPr>
+    </w:lvl>
+    <w:lvl w:ilvl="5" w:tentative="1">
+      <w:start w:val="1"/>
+      <w:numFmt w:val="bullet"/>
+      <w:lvlText w:val=""/>
+      <w:lvlJc w:val="left"/>
+      <w:pPr>
+        <w:tabs>
+          <w:tab w:val="num" w:pos="4320"/>
+        </w:tabs>
+        <w:ind w:left="4320" w:hanging="360"/>
+      </w:pPr>
+      <w:rPr>
+        <w:rFonts w:ascii="Wingdings" w:hAnsi="Wingdings" w:hint="default"/>
+        <w:sz w:val="20"/>
+      </w:rPr>
+    </w:lvl>
+    <w:lvl w:ilvl="6" w:tentative="1">
+      <w:start w:val="1"/>
+      <w:numFmt w:val="bullet"/>
+      <w:lvlText w:val=""/>
+      <w:lvlJc w:val="left"/>
+      <w:pPr>
+        <w:tabs>
+          <w:tab w:val="num" w:pos="5040"/>
+        </w:tabs>
+        <w:ind w:left="5040" w:hanging="360"/>
+      </w:pPr>
+      <w:rPr>
+        <w:rFonts w:ascii="Wingdings" w:hAnsi="Wingdings" w:hint="default"/>
+        <w:sz w:val="20"/>
+      </w:rPr>
+    </w:lvl>
+    <w:lvl w:ilvl="7" w:tentative="1">
+      <w:start w:val="1"/>
+      <w:numFmt w:val="bullet"/>
+      <w:lvlText w:val=""/>
+      <w:lvlJc w:val="left"/>
+      <w:pPr>
+        <w:tabs>
+          <w:tab w:val="num" w:pos="5760"/>
+        </w:tabs>
+        <w:ind w:left="5760" w:hanging="360"/>
+      </w:pPr>
+      <w:rPr>
+        <w:rFonts w:ascii="Wingdings" w:hAnsi="Wingdings" w:hint="default"/>
+        <w:sz w:val="20"/>
+      </w:rPr>
+    </w:lvl>
+    <w:lvl w:ilvl="8" w:tentative="1">
+      <w:start w:val="1"/>
+      <w:numFmt w:val="bullet"/>
+      <w:lvlText w:val=""/>
+      <w:lvlJc w:val="left"/>
+      <w:pPr>
+        <w:tabs>
+          <w:tab w:val="num" w:pos="6480"/>
+        </w:tabs>
+        <w:ind w:left="6480" w:hanging="360"/>
+      </w:pPr>
+      <w:rPr>
+        <w:rFonts w:ascii="Wingdings" w:hAnsi="Wingdings" w:hint="default"/>
+        <w:sz w:val="20"/>
+      </w:rPr>
+    </w:lvl>
+  </w:abstractNum>
+  <w:abstractNum w:abstractNumId="8" w15:restartNumberingAfterBreak="0">
+    <w:nsid w:val="6E2E3277"/>
+    <w:multiLevelType w:val="multilevel"/>
+    <w:tmpl w:val="55925A30"/>
+    <w:lvl w:ilvl="0">
+      <w:start w:val="1"/>
+      <w:numFmt w:val="bullet"/>
+      <w:lvlText w:val=""/>
+      <w:lvlJc w:val="left"/>
+      <w:pPr>
+        <w:tabs>
+          <w:tab w:val="num" w:pos="720"/>
+        </w:tabs>
+        <w:ind w:left="720" w:hanging="360"/>
+      </w:pPr>
+      <w:rPr>
+        <w:rFonts w:ascii="Symbol" w:hAnsi="Symbol" w:hint="default"/>
+        <w:sz w:val="20"/>
+      </w:rPr>
+    </w:lvl>
+    <w:lvl w:ilvl="1" w:tentative="1">
+      <w:start w:val="1"/>
+      <w:numFmt w:val="bullet"/>
+      <w:lvlText w:val="o"/>
+      <w:lvlJc w:val="left"/>
+      <w:pPr>
+        <w:tabs>
+          <w:tab w:val="num" w:pos="1440"/>
+        </w:tabs>
+        <w:ind w:left="1440" w:hanging="360"/>
+      </w:pPr>
+      <w:rPr>
+        <w:rFonts w:ascii="Courier New" w:hAnsi="Courier New" w:hint="default"/>
+        <w:sz w:val="20"/>
+      </w:rPr>
+    </w:lvl>
+    <w:lvl w:ilvl="2" w:tentative="1">
+      <w:start w:val="1"/>
+      <w:numFmt w:val="bullet"/>
+      <w:lvlText w:val=""/>
+      <w:lvlJc w:val="left"/>
+      <w:pPr>
+        <w:tabs>
+          <w:tab w:val="num" w:pos="2160"/>
+        </w:tabs>
+        <w:ind w:left="2160" w:hanging="360"/>
+      </w:pPr>
+      <w:rPr>
+        <w:rFonts w:ascii="Wingdings" w:hAnsi="Wingdings" w:hint="default"/>
+        <w:sz w:val="20"/>
+      </w:rPr>
+    </w:lvl>
+    <w:lvl w:ilvl="3" w:tentative="1">
+      <w:start w:val="1"/>
+      <w:numFmt w:val="bullet"/>
+      <w:lvlText w:val=""/>
+      <w:lvlJc w:val="left"/>
+      <w:pPr>
+        <w:tabs>
+          <w:tab w:val="num" w:pos="2880"/>
+        </w:tabs>
+        <w:ind w:left="2880" w:hanging="360"/>
+      </w:pPr>
+      <w:rPr>
+        <w:rFonts w:ascii="Wingdings" w:hAnsi="Wingdings" w:hint="default"/>
+        <w:sz w:val="20"/>
+      </w:rPr>
+    </w:lvl>
+    <w:lvl w:ilvl="4" w:tentative="1">
+      <w:start w:val="1"/>
+      <w:numFmt w:val="bullet"/>
+      <w:lvlText w:val=""/>
+      <w:lvlJc w:val="left"/>
+      <w:pPr>
+        <w:tabs>
+          <w:tab w:val="num" w:pos="3600"/>
+        </w:tabs>
+        <w:ind w:left="3600" w:hanging="360"/>
+      </w:pPr>
+      <w:rPr>
+        <w:rFonts w:ascii="Wingdings" w:hAnsi="Wingdings" w:hint="default"/>
+        <w:sz w:val="20"/>
+      </w:rPr>
+    </w:lvl>
+    <w:lvl w:ilvl="5" w:tentative="1">
+      <w:start w:val="1"/>
+      <w:numFmt w:val="bullet"/>
+      <w:lvlText w:val=""/>
+      <w:lvlJc w:val="left"/>
+      <w:pPr>
+        <w:tabs>
+          <w:tab w:val="num" w:pos="4320"/>
+        </w:tabs>
+        <w:ind w:left="4320" w:hanging="360"/>
+      </w:pPr>
+      <w:rPr>
+        <w:rFonts w:ascii="Wingdings" w:hAnsi="Wingdings" w:hint="default"/>
+        <w:sz w:val="20"/>
+      </w:rPr>
+    </w:lvl>
+    <w:lvl w:ilvl="6" w:tentative="1">
+      <w:start w:val="1"/>
+      <w:numFmt w:val="bullet"/>
+      <w:lvlText w:val=""/>
+      <w:lvlJc w:val="left"/>
+      <w:pPr>
+        <w:tabs>
+          <w:tab w:val="num" w:pos="5040"/>
+        </w:tabs>
+        <w:ind w:left="5040" w:hanging="360"/>
+      </w:pPr>
+      <w:rPr>
+        <w:rFonts w:ascii="Wingdings" w:hAnsi="Wingdings" w:hint="default"/>
+        <w:sz w:val="20"/>
+      </w:rPr>
+    </w:lvl>
+    <w:lvl w:ilvl="7" w:tentative="1">
+      <w:start w:val="1"/>
+      <w:numFmt w:val="bullet"/>
+      <w:lvlText w:val=""/>
+      <w:lvlJc w:val="left"/>
+      <w:pPr>
+        <w:tabs>
+          <w:tab w:val="num" w:pos="5760"/>
+        </w:tabs>
+        <w:ind w:left="5760" w:hanging="360"/>
+      </w:pPr>
+      <w:rPr>
+        <w:rFonts w:ascii="Wingdings" w:hAnsi="Wingdings" w:hint="default"/>
+        <w:sz w:val="20"/>
+      </w:rPr>
+    </w:lvl>
+    <w:lvl w:ilvl="8" w:tentative="1">
+      <w:start w:val="1"/>
+      <w:numFmt w:val="bullet"/>
+      <w:lvlText w:val=""/>
+      <w:lvlJc w:val="left"/>
+      <w:pPr>
+        <w:tabs>
+          <w:tab w:val="num" w:pos="6480"/>
+        </w:tabs>
+        <w:ind w:left="6480" w:hanging="360"/>
+      </w:pPr>
+      <w:rPr>
+        <w:rFonts w:ascii="Wingdings" w:hAnsi="Wingdings" w:hint="default"/>
+        <w:sz w:val="20"/>
+      </w:rPr>
+    </w:lvl>
+  </w:abstractNum>
+  <w:abstractNum w:abstractNumId="9" w15:restartNumberingAfterBreak="0">
     <w:nsid w:val="70041059"/>
     <w:multiLevelType w:val="hybridMultilevel"/>
     <w:tmpl w:val="AE1E4B30"/>
@@ -3706,7 +5504,7 @@
       </w:rPr>
     </w:lvl>
   </w:abstractNum>
-  <w:abstractNum w:abstractNumId="6" w15:restartNumberingAfterBreak="0">
+  <w:abstractNum w:abstractNumId="10" w15:restartNumberingAfterBreak="0">
     <w:nsid w:val="763E0881"/>
     <w:multiLevelType w:val="hybridMultilevel"/>
     <w:tmpl w:val="045C92DA"/>
@@ -3795,7 +5593,7 @@
       </w:pPr>
     </w:lvl>
   </w:abstractNum>
-  <w:abstractNum w:abstractNumId="7" w15:restartNumberingAfterBreak="0">
+  <w:abstractNum w:abstractNumId="11" w15:restartNumberingAfterBreak="0">
     <w:nsid w:val="791B4860"/>
     <w:multiLevelType w:val="hybridMultilevel"/>
     <w:tmpl w:val="44946AFA"/>
@@ -3884,7 +5682,7 @@
       </w:pPr>
     </w:lvl>
   </w:abstractNum>
-  <w:abstractNum w:abstractNumId="8" w15:restartNumberingAfterBreak="0">
+  <w:abstractNum w:abstractNumId="12" w15:restartNumberingAfterBreak="0">
     <w:nsid w:val="7B1B0FED"/>
     <w:multiLevelType w:val="multilevel"/>
     <w:tmpl w:val="0809001F"/>
@@ -3974,31 +5772,43 @@
     </w:lvl>
   </w:abstractNum>
   <w:num w:numId="1" w16cid:durableId="519975934">
+    <w:abstractNumId w:val="4"/>
+  </w:num>
+  <w:num w:numId="2" w16cid:durableId="1638880200">
     <w:abstractNumId w:val="2"/>
   </w:num>
-  <w:num w:numId="2" w16cid:durableId="1638880200">
-    <w:abstractNumId w:val="1"/>
-  </w:num>
   <w:num w:numId="3" w16cid:durableId="1947417518">
-    <w:abstractNumId w:val="3"/>
+    <w:abstractNumId w:val="5"/>
   </w:num>
   <w:num w:numId="4" w16cid:durableId="1667171492">
+    <w:abstractNumId w:val="10"/>
+  </w:num>
+  <w:num w:numId="5" w16cid:durableId="1143082400">
     <w:abstractNumId w:val="6"/>
   </w:num>
-  <w:num w:numId="5" w16cid:durableId="1143082400">
-    <w:abstractNumId w:val="4"/>
-  </w:num>
   <w:num w:numId="6" w16cid:durableId="21832692">
-    <w:abstractNumId w:val="5"/>
+    <w:abstractNumId w:val="9"/>
   </w:num>
   <w:num w:numId="7" w16cid:durableId="956791090">
-    <w:abstractNumId w:val="7"/>
+    <w:abstractNumId w:val="11"/>
   </w:num>
   <w:num w:numId="8" w16cid:durableId="1275408726">
-    <w:abstractNumId w:val="8"/>
+    <w:abstractNumId w:val="12"/>
   </w:num>
   <w:num w:numId="9" w16cid:durableId="1650817803">
     <w:abstractNumId w:val="0"/>
+  </w:num>
+  <w:num w:numId="10" w16cid:durableId="1168132923">
+    <w:abstractNumId w:val="1"/>
+  </w:num>
+  <w:num w:numId="11" w16cid:durableId="1255018299">
+    <w:abstractNumId w:val="7"/>
+  </w:num>
+  <w:num w:numId="12" w16cid:durableId="109322528">
+    <w:abstractNumId w:val="3"/>
+  </w:num>
+  <w:num w:numId="13" w16cid:durableId="585573934">
+    <w:abstractNumId w:val="8"/>
   </w:num>
 </w:numbering>
 </file>
@@ -4606,7 +6416,6 @@
   <w:style w:type="character" w:default="1" w:styleId="DefaultParagraphFont">
     <w:name w:val="Default Paragraph Font"/>
     <w:uiPriority w:val="1"/>
-    <w:semiHidden/>
     <w:unhideWhenUsed/>
   </w:style>
   <w:style w:type="table" w:default="1" w:styleId="TableNormal">
@@ -5339,6 +7148,18 @@
 </file>
 
 <file path=customXml/item1.xml><?xml version="1.0" encoding="utf-8"?>
+<b:Sources xmlns:b="http://schemas.openxmlformats.org/officeDocument/2006/bibliography" xmlns="http://schemas.openxmlformats.org/officeDocument/2006/bibliography" SelectedStyle="\APASixthEditionOfficeOnline.xsl" StyleName="APA" Version="6"/>
+</file>
+
+<file path=customXml/item2.xml><?xml version="1.0" encoding="utf-8"?>
+<p:properties xmlns:p="http://schemas.microsoft.com/office/2006/metadata/properties" xmlns:xsi="http://www.w3.org/2001/XMLSchema-instance" xmlns:pc="http://schemas.microsoft.com/office/infopath/2007/PartnerControls">
+  <documentManagement>
+    <ReferenceId xmlns="3d32c1b5-b381-4421-af40-a15050b1ff0f" xsi:nil="true"/>
+  </documentManagement>
+</p:properties>
+</file>
+
+<file path=customXml/item3.xml><?xml version="1.0" encoding="utf-8"?>
 <?mso-contentType ?>
 <FormTemplates xmlns="http://schemas.microsoft.com/sharepoint/v3/contenttype/forms">
   <Display>DocumentLibraryForm</Display>
@@ -5347,7 +7168,7 @@
 </FormTemplates>
 </file>
 
-<file path=customXml/item2.xml><?xml version="1.0" encoding="utf-8"?>
+<file path=customXml/item4.xml><?xml version="1.0" encoding="utf-8"?>
 <ct:contentTypeSchema xmlns:ct="http://schemas.microsoft.com/office/2006/metadata/contentType" xmlns:ma="http://schemas.microsoft.com/office/2006/metadata/properties/metaAttributes" ct:_="" ma:_="" ma:contentTypeName="Document" ma:contentTypeID="0x01010095510E12269E844FB330C62C61A57173" ma:contentTypeVersion="4" ma:contentTypeDescription="Create a new document." ma:contentTypeScope="" ma:versionID="8e55dc14d93c57c944f4e297c08fdea1">
   <xsd:schema xmlns:xsd="http://www.w3.org/2001/XMLSchema" xmlns:xs="http://www.w3.org/2001/XMLSchema" xmlns:p="http://schemas.microsoft.com/office/2006/metadata/properties" xmlns:ns2="3d32c1b5-b381-4421-af40-a15050b1ff0f" targetNamespace="http://schemas.microsoft.com/office/2006/metadata/properties" ma:root="true" ma:fieldsID="75d0720f95c38ca2981846f4d3943047" ns2:_="">
     <xsd:import namespace="3d32c1b5-b381-4421-af40-a15050b1ff0f"/>
@@ -5491,19 +7312,25 @@
 </ct:contentTypeSchema>
 </file>
 
-<file path=customXml/item3.xml><?xml version="1.0" encoding="utf-8"?>
-<b:Sources xmlns:b="http://schemas.openxmlformats.org/officeDocument/2006/bibliography" xmlns="http://schemas.openxmlformats.org/officeDocument/2006/bibliography" SelectedStyle="\APASixthEditionOfficeOnline.xsl" StyleName="APA" Version="6"/>
+<file path=customXml/itemProps1.xml><?xml version="1.0" encoding="utf-8"?>
+<ds:datastoreItem xmlns:ds="http://schemas.openxmlformats.org/officeDocument/2006/customXml" ds:itemID="{64951C4C-C1FD-48A0-9079-4FE4363E8616}">
+  <ds:schemaRefs>
+    <ds:schemaRef ds:uri="http://schemas.openxmlformats.org/officeDocument/2006/bibliography"/>
+  </ds:schemaRefs>
+</ds:datastoreItem>
 </file>
 
-<file path=customXml/item4.xml><?xml version="1.0" encoding="utf-8"?>
-<p:properties xmlns:p="http://schemas.microsoft.com/office/2006/metadata/properties" xmlns:xsi="http://www.w3.org/2001/XMLSchema-instance" xmlns:pc="http://schemas.microsoft.com/office/infopath/2007/PartnerControls">
-  <documentManagement>
-    <ReferenceId xmlns="3d32c1b5-b381-4421-af40-a15050b1ff0f" xsi:nil="true"/>
-  </documentManagement>
-</p:properties>
+<file path=customXml/itemProps2.xml><?xml version="1.0" encoding="utf-8"?>
+<ds:datastoreItem xmlns:ds="http://schemas.openxmlformats.org/officeDocument/2006/customXml" ds:itemID="{5B726337-09AC-47F1-8028-BEB6EF533241}">
+  <ds:schemaRefs>
+    <ds:schemaRef ds:uri="http://schemas.microsoft.com/office/2006/metadata/properties"/>
+    <ds:schemaRef ds:uri="http://schemas.microsoft.com/office/infopath/2007/PartnerControls"/>
+    <ds:schemaRef ds:uri="3d32c1b5-b381-4421-af40-a15050b1ff0f"/>
+  </ds:schemaRefs>
+</ds:datastoreItem>
 </file>
 
-<file path=customXml/itemProps1.xml><?xml version="1.0" encoding="utf-8"?>
+<file path=customXml/itemProps3.xml><?xml version="1.0" encoding="utf-8"?>
 <ds:datastoreItem xmlns:ds="http://schemas.openxmlformats.org/officeDocument/2006/customXml" ds:itemID="{A0712809-C35E-44D9-9BF5-2957DB0041BE}">
   <ds:schemaRefs>
     <ds:schemaRef ds:uri="http://schemas.microsoft.com/sharepoint/v3/contenttype/forms"/>
@@ -5511,7 +7338,7 @@
 </ds:datastoreItem>
 </file>
 
-<file path=customXml/itemProps2.xml><?xml version="1.0" encoding="utf-8"?>
+<file path=customXml/itemProps4.xml><?xml version="1.0" encoding="utf-8"?>
 <ds:datastoreItem xmlns:ds="http://schemas.openxmlformats.org/officeDocument/2006/customXml" ds:itemID="{6E515EEC-90D7-46A1-9A6C-50812DA85BEF}">
   <ds:schemaRefs>
     <ds:schemaRef ds:uri="http://schemas.microsoft.com/office/2006/metadata/contentType"/>
@@ -5527,22 +7354,4 @@
     <ds:schemaRef ds:uri="http://schemas.microsoft.com/internal/obd"/>
   </ds:schemaRefs>
 </ds:datastoreItem>
-</file>
-
-<file path=customXml/itemProps3.xml><?xml version="1.0" encoding="utf-8"?>
-<ds:datastoreItem xmlns:ds="http://schemas.openxmlformats.org/officeDocument/2006/customXml" ds:itemID="{64951C4C-C1FD-48A0-9079-4FE4363E8616}">
-  <ds:schemaRefs>
-    <ds:schemaRef ds:uri="http://schemas.openxmlformats.org/officeDocument/2006/bibliography"/>
-  </ds:schemaRefs>
-</ds:datastoreItem>
-</file>
-
-<file path=customXml/itemProps4.xml><?xml version="1.0" encoding="utf-8"?>
-<ds:datastoreItem xmlns:ds="http://schemas.openxmlformats.org/officeDocument/2006/customXml" ds:itemID="{5B726337-09AC-47F1-8028-BEB6EF533241}">
-  <ds:schemaRefs>
-    <ds:schemaRef ds:uri="http://schemas.microsoft.com/office/2006/metadata/properties"/>
-    <ds:schemaRef ds:uri="http://schemas.microsoft.com/office/infopath/2007/PartnerControls"/>
-    <ds:schemaRef ds:uri="3d32c1b5-b381-4421-af40-a15050b1ff0f"/>
-  </ds:schemaRefs>
-</ds:datastoreItem>
 </file>
</xml_diff>

<commit_message>
Program with analysis every state
</commit_message>
<xml_diff>
--- a/NEA.docx
+++ b/NEA.docx
@@ -12165,15 +12165,7 @@
       </w:r>
       <w:proofErr w:type="spellEnd"/>
       <w:r>
-        <w:t xml:space="preserve"> = </w:t>
-      </w:r>
-      <w:proofErr w:type="spellStart"/>
-      <w:r>
-        <w:t>self.copy</w:t>
-      </w:r>
-      <w:proofErr w:type="spellEnd"/>
-      <w:r>
-        <w:t>()</w:t>
+        <w:t xml:space="preserve"> = self.copy()</w:t>
       </w:r>
     </w:p>
     <w:p>
@@ -15782,6 +15774,64 @@
       </w:r>
       <w:proofErr w:type="spellEnd"/>
       <w:r>
+        <w:t xml:space="preserve">, to_pos in </w:t>
+      </w:r>
+      <w:proofErr w:type="spellStart"/>
+      <w:r>
+        <w:t>board.get_all_legal_moves</w:t>
+      </w:r>
+      <w:proofErr w:type="spellEnd"/>
+      <w:r>
+        <w:t>(</w:t>
+      </w:r>
+      <w:proofErr w:type="spellStart"/>
+      <w:r>
+        <w:t>self.colour</w:t>
+      </w:r>
+      <w:proofErr w:type="spellEnd"/>
+      <w:r>
+        <w:t>):</w:t>
+      </w:r>
+    </w:p>
+    <w:p>
+      <w:r>
+        <w:t xml:space="preserve">                </w:t>
+      </w:r>
+      <w:proofErr w:type="spellStart"/>
+      <w:r>
+        <w:t>new_board</w:t>
+      </w:r>
+      <w:proofErr w:type="spellEnd"/>
+      <w:r>
+        <w:t xml:space="preserve"> = </w:t>
+      </w:r>
+      <w:proofErr w:type="spellStart"/>
+      <w:r>
+        <w:t>board.copy</w:t>
+      </w:r>
+      <w:proofErr w:type="spellEnd"/>
+      <w:r>
+        <w:t>()</w:t>
+      </w:r>
+    </w:p>
+    <w:p>
+      <w:r>
+        <w:t>                new_board._</w:t>
+      </w:r>
+      <w:proofErr w:type="spellStart"/>
+      <w:r>
+        <w:t>force_move</w:t>
+      </w:r>
+      <w:proofErr w:type="spellEnd"/>
+      <w:r>
+        <w:t>(</w:t>
+      </w:r>
+      <w:proofErr w:type="spellStart"/>
+      <w:r>
+        <w:t>from_pos</w:t>
+      </w:r>
+      <w:proofErr w:type="spellEnd"/>
+      <w:r>
         <w:t xml:space="preserve">, </w:t>
       </w:r>
       <w:proofErr w:type="spellStart"/>
@@ -15790,57 +15840,137 @@
       </w:r>
       <w:proofErr w:type="spellEnd"/>
       <w:r>
-        <w:t xml:space="preserve"> in </w:t>
-      </w:r>
-      <w:proofErr w:type="spellStart"/>
-      <w:r>
-        <w:t>board.get_all_legal_moves</w:t>
+        <w:t>)</w:t>
+      </w:r>
+    </w:p>
+    <w:p/>
+    <w:p>
+      <w:r>
+        <w:t xml:space="preserve">                </w:t>
+      </w:r>
+      <w:proofErr w:type="spellStart"/>
+      <w:r>
+        <w:t>eval_score</w:t>
+      </w:r>
+      <w:proofErr w:type="spellEnd"/>
+      <w:r>
+        <w:t xml:space="preserve"> = </w:t>
+      </w:r>
+      <w:proofErr w:type="spellStart"/>
+      <w:r>
+        <w:t>self.minimax</w:t>
       </w:r>
       <w:proofErr w:type="spellEnd"/>
       <w:r>
         <w:t>(</w:t>
       </w:r>
-      <w:proofErr w:type="spellStart"/>
-      <w:r>
-        <w:t>self.colour</w:t>
-      </w:r>
-      <w:proofErr w:type="spellEnd"/>
-      <w:r>
-        <w:t>):</w:t>
-      </w:r>
-    </w:p>
+    </w:p>
+    <w:p>
+      <w:r>
+        <w:t xml:space="preserve">                    </w:t>
+      </w:r>
+      <w:proofErr w:type="spellStart"/>
+      <w:r>
+        <w:t>new_board</w:t>
+      </w:r>
+      <w:proofErr w:type="spellEnd"/>
+      <w:r>
+        <w:t>, depth - 1, alpha, beta, False</w:t>
+      </w:r>
+    </w:p>
+    <w:p>
+      <w:r>
+        <w:t>                )</w:t>
+      </w:r>
+    </w:p>
+    <w:p/>
     <w:p>
       <w:r>
         <w:t xml:space="preserve">                </w:t>
       </w:r>
       <w:proofErr w:type="spellStart"/>
       <w:r>
-        <w:t>new_board</w:t>
-      </w:r>
-      <w:proofErr w:type="spellEnd"/>
-      <w:r>
-        <w:t xml:space="preserve"> = </w:t>
-      </w:r>
-      <w:proofErr w:type="spellStart"/>
-      <w:r>
-        <w:t>board.copy</w:t>
-      </w:r>
-      <w:proofErr w:type="spellEnd"/>
-      <w:r>
-        <w:t>()</w:t>
-      </w:r>
-    </w:p>
-    <w:p>
-      <w:r>
-        <w:t>                new_board._</w:t>
-      </w:r>
-      <w:proofErr w:type="spellStart"/>
-      <w:r>
-        <w:t>force_move</w:t>
-      </w:r>
-      <w:proofErr w:type="spellEnd"/>
-      <w:r>
-        <w:t>(</w:t>
+        <w:t>max_eval</w:t>
+      </w:r>
+      <w:proofErr w:type="spellEnd"/>
+      <w:r>
+        <w:t xml:space="preserve"> = max(</w:t>
+      </w:r>
+      <w:proofErr w:type="spellStart"/>
+      <w:r>
+        <w:t>max_eval</w:t>
+      </w:r>
+      <w:proofErr w:type="spellEnd"/>
+      <w:r>
+        <w:t xml:space="preserve">, </w:t>
+      </w:r>
+      <w:proofErr w:type="spellStart"/>
+      <w:r>
+        <w:t>eval_score</w:t>
+      </w:r>
+      <w:proofErr w:type="spellEnd"/>
+      <w:r>
+        <w:t>)</w:t>
+      </w:r>
+    </w:p>
+    <w:p>
+      <w:r>
+        <w:t xml:space="preserve">                alpha = max(alpha, </w:t>
+      </w:r>
+      <w:proofErr w:type="spellStart"/>
+      <w:r>
+        <w:t>eval_score</w:t>
+      </w:r>
+      <w:proofErr w:type="spellEnd"/>
+      <w:r>
+        <w:t>)</w:t>
+      </w:r>
+    </w:p>
+    <w:p/>
+    <w:p>
+      <w:r>
+        <w:t>                if beta &lt;= alpha:</w:t>
+      </w:r>
+    </w:p>
+    <w:p>
+      <w:r>
+        <w:t>                    break</w:t>
+      </w:r>
+    </w:p>
+    <w:p/>
+    <w:p>
+      <w:r>
+        <w:t xml:space="preserve">            return </w:t>
+      </w:r>
+      <w:proofErr w:type="spellStart"/>
+      <w:r>
+        <w:t>max_eval</w:t>
+      </w:r>
+      <w:proofErr w:type="spellEnd"/>
+    </w:p>
+    <w:p/>
+    <w:p>
+      <w:r>
+        <w:t>        else:</w:t>
+      </w:r>
+    </w:p>
+    <w:p>
+      <w:r>
+        <w:t xml:space="preserve">            </w:t>
+      </w:r>
+      <w:proofErr w:type="spellStart"/>
+      <w:r>
+        <w:t>min_eval</w:t>
+      </w:r>
+      <w:proofErr w:type="spellEnd"/>
+      <w:r>
+        <w:t xml:space="preserve"> = float("inf")</w:t>
+      </w:r>
+    </w:p>
+    <w:p/>
+    <w:p>
+      <w:r>
+        <w:t xml:space="preserve">            for </w:t>
       </w:r>
       <w:proofErr w:type="spellStart"/>
       <w:r>
@@ -15848,161 +15978,7 @@
       </w:r>
       <w:proofErr w:type="spellEnd"/>
       <w:r>
-        <w:t xml:space="preserve">, </w:t>
-      </w:r>
-      <w:proofErr w:type="spellStart"/>
-      <w:r>
-        <w:t>to_pos</w:t>
-      </w:r>
-      <w:proofErr w:type="spellEnd"/>
-      <w:r>
-        <w:t>)</w:t>
-      </w:r>
-    </w:p>
-    <w:p/>
-    <w:p>
-      <w:r>
-        <w:t xml:space="preserve">                </w:t>
-      </w:r>
-      <w:proofErr w:type="spellStart"/>
-      <w:r>
-        <w:t>eval_score</w:t>
-      </w:r>
-      <w:proofErr w:type="spellEnd"/>
-      <w:r>
-        <w:t xml:space="preserve"> = </w:t>
-      </w:r>
-      <w:proofErr w:type="spellStart"/>
-      <w:r>
-        <w:t>self.minimax</w:t>
-      </w:r>
-      <w:proofErr w:type="spellEnd"/>
-      <w:r>
-        <w:t>(</w:t>
-      </w:r>
-    </w:p>
-    <w:p>
-      <w:r>
-        <w:t xml:space="preserve">                    </w:t>
-      </w:r>
-      <w:proofErr w:type="spellStart"/>
-      <w:r>
-        <w:t>new_board</w:t>
-      </w:r>
-      <w:proofErr w:type="spellEnd"/>
-      <w:r>
-        <w:t>, depth - 1, alpha, beta, False</w:t>
-      </w:r>
-    </w:p>
-    <w:p>
-      <w:r>
-        <w:t>                )</w:t>
-      </w:r>
-    </w:p>
-    <w:p/>
-    <w:p>
-      <w:r>
-        <w:t xml:space="preserve">                </w:t>
-      </w:r>
-      <w:proofErr w:type="spellStart"/>
-      <w:r>
-        <w:t>max_eval</w:t>
-      </w:r>
-      <w:proofErr w:type="spellEnd"/>
-      <w:r>
-        <w:t xml:space="preserve"> = max(</w:t>
-      </w:r>
-      <w:proofErr w:type="spellStart"/>
-      <w:r>
-        <w:t>max_eval</w:t>
-      </w:r>
-      <w:proofErr w:type="spellEnd"/>
-      <w:r>
-        <w:t xml:space="preserve">, </w:t>
-      </w:r>
-      <w:proofErr w:type="spellStart"/>
-      <w:r>
-        <w:t>eval_score</w:t>
-      </w:r>
-      <w:proofErr w:type="spellEnd"/>
-      <w:r>
-        <w:t>)</w:t>
-      </w:r>
-    </w:p>
-    <w:p>
-      <w:r>
-        <w:t xml:space="preserve">                alpha = max(alpha, </w:t>
-      </w:r>
-      <w:proofErr w:type="spellStart"/>
-      <w:r>
-        <w:t>eval_score</w:t>
-      </w:r>
-      <w:proofErr w:type="spellEnd"/>
-      <w:r>
-        <w:t>)</w:t>
-      </w:r>
-    </w:p>
-    <w:p/>
-    <w:p>
-      <w:r>
-        <w:t>                if beta &lt;= alpha:</w:t>
-      </w:r>
-    </w:p>
-    <w:p>
-      <w:r>
-        <w:t>                    break</w:t>
-      </w:r>
-    </w:p>
-    <w:p/>
-    <w:p>
-      <w:r>
-        <w:t xml:space="preserve">            return </w:t>
-      </w:r>
-      <w:proofErr w:type="spellStart"/>
-      <w:r>
-        <w:t>max_eval</w:t>
-      </w:r>
-      <w:proofErr w:type="spellEnd"/>
-    </w:p>
-    <w:p/>
-    <w:p>
-      <w:r>
-        <w:t>        else:</w:t>
-      </w:r>
-    </w:p>
-    <w:p>
-      <w:r>
-        <w:t xml:space="preserve">            </w:t>
-      </w:r>
-      <w:proofErr w:type="spellStart"/>
-      <w:r>
-        <w:t>min_eval</w:t>
-      </w:r>
-      <w:proofErr w:type="spellEnd"/>
-      <w:r>
-        <w:t xml:space="preserve"> = float("inf")</w:t>
-      </w:r>
-    </w:p>
-    <w:p/>
-    <w:p>
-      <w:r>
-        <w:t xml:space="preserve">            for </w:t>
-      </w:r>
-      <w:proofErr w:type="spellStart"/>
-      <w:r>
-        <w:t>from_pos</w:t>
-      </w:r>
-      <w:proofErr w:type="spellEnd"/>
-      <w:r>
-        <w:t xml:space="preserve">, </w:t>
-      </w:r>
-      <w:proofErr w:type="spellStart"/>
-      <w:r>
-        <w:t>to_pos</w:t>
-      </w:r>
-      <w:proofErr w:type="spellEnd"/>
-      <w:r>
-        <w:t xml:space="preserve"> in </w:t>
+        <w:t xml:space="preserve">, to_pos in </w:t>
       </w:r>
       <w:proofErr w:type="spellStart"/>
       <w:r>
@@ -17497,15 +17473,7 @@
       </w:r>
       <w:proofErr w:type="spellEnd"/>
       <w:r>
-        <w:t xml:space="preserve">, </w:t>
-      </w:r>
-      <w:proofErr w:type="spellStart"/>
-      <w:r>
-        <w:t>piece_type</w:t>
-      </w:r>
-      <w:proofErr w:type="spellEnd"/>
-      <w:r>
-        <w:t xml:space="preserve"> in enumerate(</w:t>
+        <w:t>, piece_type in enumerate(</w:t>
       </w:r>
       <w:proofErr w:type="spellStart"/>
       <w:r>
@@ -18499,11 +18467,53 @@
       </w:r>
       <w:proofErr w:type="spellEnd"/>
       <w:r>
+        <w:t xml:space="preserve"> == p.QUIT:</w:t>
+      </w:r>
+    </w:p>
+    <w:p>
+      <w:r>
+        <w:t>                    running = False</w:t>
+      </w:r>
+    </w:p>
+    <w:p>
+      <w:r>
+        <w:t xml:space="preserve">                </w:t>
+      </w:r>
+      <w:proofErr w:type="spellStart"/>
+      <w:r>
+        <w:t>elif</w:t>
+      </w:r>
+      <w:proofErr w:type="spellEnd"/>
+      <w:r>
+        <w:t xml:space="preserve"> </w:t>
+      </w:r>
+      <w:proofErr w:type="spellStart"/>
+      <w:r>
+        <w:t>event.type</w:t>
+      </w:r>
+      <w:proofErr w:type="spellEnd"/>
+      <w:r>
         <w:t xml:space="preserve"> == </w:t>
       </w:r>
       <w:proofErr w:type="spellStart"/>
       <w:r>
-        <w:t>p.QUIT</w:t>
+        <w:t>p.MOUSEBUTTONDOWN</w:t>
+      </w:r>
+      <w:proofErr w:type="spellEnd"/>
+      <w:r>
+        <w:t xml:space="preserve"> and not </w:t>
+      </w:r>
+      <w:proofErr w:type="spellStart"/>
+      <w:r>
+        <w:t>self.game.pending_promotion</w:t>
+      </w:r>
+      <w:proofErr w:type="spellEnd"/>
+      <w:r>
+        <w:t xml:space="preserve"> and </w:t>
+      </w:r>
+      <w:proofErr w:type="spellStart"/>
+      <w:r>
+        <w:t>self.game.started</w:t>
       </w:r>
       <w:proofErr w:type="spellEnd"/>
       <w:r>
@@ -18512,7 +18522,23 @@
     </w:p>
     <w:p>
       <w:r>
-        <w:t>                    running = False</w:t>
+        <w:t xml:space="preserve">                    </w:t>
+      </w:r>
+      <w:proofErr w:type="spellStart"/>
+      <w:r>
+        <w:t>self.game.handle_click</w:t>
+      </w:r>
+      <w:proofErr w:type="spellEnd"/>
+      <w:r>
+        <w:t>(</w:t>
+      </w:r>
+      <w:proofErr w:type="spellStart"/>
+      <w:r>
+        <w:t>pos</w:t>
+      </w:r>
+      <w:proofErr w:type="spellEnd"/>
+      <w:r>
+        <w:t>)</w:t>
       </w:r>
     </w:p>
     <w:p>
@@ -18545,28 +18571,438 @@
       </w:r>
       <w:proofErr w:type="spellStart"/>
       <w:r>
+        <w:t>self.game.started</w:t>
+      </w:r>
+      <w:proofErr w:type="spellEnd"/>
+      <w:r>
+        <w:t>:</w:t>
+      </w:r>
+    </w:p>
+    <w:p>
+      <w:r>
+        <w:t xml:space="preserve">                    result = </w:t>
+      </w:r>
+      <w:proofErr w:type="spellStart"/>
+      <w:r>
+        <w:t>self.rendering.start_menu_click</w:t>
+      </w:r>
+      <w:proofErr w:type="spellEnd"/>
+      <w:r>
+        <w:t>(</w:t>
+      </w:r>
+      <w:proofErr w:type="spellStart"/>
+      <w:r>
+        <w:t>p.mouse.get_pos</w:t>
+      </w:r>
+      <w:proofErr w:type="spellEnd"/>
+      <w:r>
+        <w:t>())</w:t>
+      </w:r>
+    </w:p>
+    <w:p>
+      <w:r>
+        <w:t>                    if result:</w:t>
+      </w:r>
+    </w:p>
+    <w:p>
+      <w:r>
+        <w:t>                        kind, value = result</w:t>
+      </w:r>
+    </w:p>
+    <w:p>
+      <w:r>
+        <w:t xml:space="preserve">                        </w:t>
+      </w:r>
+      <w:proofErr w:type="spellStart"/>
+      <w:r>
+        <w:t>self.game.handle_start_menu_choice</w:t>
+      </w:r>
+      <w:proofErr w:type="spellEnd"/>
+      <w:r>
+        <w:t>(kind, value)</w:t>
+      </w:r>
+    </w:p>
+    <w:p>
+      <w:r>
+        <w:t>                        print("Menu choice:", kind, value)</w:t>
+      </w:r>
+    </w:p>
+    <w:p>
+      <w:r>
+        <w:t xml:space="preserve">                        print("Player colour:", </w:t>
+      </w:r>
+      <w:proofErr w:type="spellStart"/>
+      <w:r>
+        <w:t>self.game.player_colour</w:t>
+      </w:r>
+      <w:proofErr w:type="spellEnd"/>
+      <w:r>
+        <w:t>)</w:t>
+      </w:r>
+    </w:p>
+    <w:p>
+      <w:r>
+        <w:t xml:space="preserve">                        print("Vs AI:", </w:t>
+      </w:r>
+      <w:proofErr w:type="spellStart"/>
+      <w:r>
+        <w:t>self.game.vs_ai</w:t>
+      </w:r>
+      <w:proofErr w:type="spellEnd"/>
+      <w:r>
+        <w:t>)</w:t>
+      </w:r>
+    </w:p>
+    <w:p/>
+    <w:p>
+      <w:r>
+        <w:t>                    # CREATE AI HERE</w:t>
+      </w:r>
+    </w:p>
+    <w:p>
+      <w:r>
+        <w:t xml:space="preserve">                        if </w:t>
+      </w:r>
+      <w:proofErr w:type="spellStart"/>
+      <w:r>
+        <w:t>self.game.vs_ai</w:t>
+      </w:r>
+      <w:proofErr w:type="spellEnd"/>
+      <w:r>
+        <w:t xml:space="preserve"> and self.game.ai is None and </w:t>
+      </w:r>
+      <w:proofErr w:type="spellStart"/>
+      <w:r>
+        <w:t>self.game.player_colour</w:t>
+      </w:r>
+      <w:proofErr w:type="spellEnd"/>
+      <w:r>
+        <w:t xml:space="preserve"> is not None:</w:t>
+      </w:r>
+    </w:p>
+    <w:p>
+      <w:r>
+        <w:t xml:space="preserve">                            </w:t>
+      </w:r>
+      <w:proofErr w:type="spellStart"/>
+      <w:r>
+        <w:t>ai_colour</w:t>
+      </w:r>
+      <w:proofErr w:type="spellEnd"/>
+      <w:r>
+        <w:t xml:space="preserve"> = "black" if </w:t>
+      </w:r>
+      <w:proofErr w:type="spellStart"/>
+      <w:r>
+        <w:t>self.game.player_colour</w:t>
+      </w:r>
+      <w:proofErr w:type="spellEnd"/>
+      <w:r>
+        <w:t xml:space="preserve"> == "white" else "white"</w:t>
+      </w:r>
+    </w:p>
+    <w:p>
+      <w:r>
+        <w:t xml:space="preserve">                            self.game.ai = </w:t>
+      </w:r>
+      <w:proofErr w:type="spellStart"/>
+      <w:r>
+        <w:t>ChessAI</w:t>
+      </w:r>
+      <w:proofErr w:type="spellEnd"/>
+      <w:r>
+        <w:t>(</w:t>
+      </w:r>
+      <w:proofErr w:type="spellStart"/>
+      <w:r>
+        <w:t>ai_colour</w:t>
+      </w:r>
+      <w:proofErr w:type="spellEnd"/>
+      <w:r>
+        <w:t>, depth=2)</w:t>
+      </w:r>
+    </w:p>
+    <w:p>
+      <w:r>
+        <w:t xml:space="preserve">                            </w:t>
+      </w:r>
+      <w:proofErr w:type="spellStart"/>
+      <w:r>
+        <w:t>self.analysis_window</w:t>
+      </w:r>
+      <w:proofErr w:type="spellEnd"/>
+      <w:r>
+        <w:t xml:space="preserve"> = </w:t>
+      </w:r>
+      <w:proofErr w:type="spellStart"/>
+      <w:r>
+        <w:t>AnalysisWindow</w:t>
+      </w:r>
+      <w:proofErr w:type="spellEnd"/>
+      <w:r>
+        <w:t>(self.game.ai)</w:t>
+      </w:r>
+    </w:p>
+    <w:p>
+      <w:r>
+        <w:t xml:space="preserve">                            </w:t>
+      </w:r>
+      <w:proofErr w:type="spellStart"/>
+      <w:r>
+        <w:t>self.game.started</w:t>
+      </w:r>
+      <w:proofErr w:type="spellEnd"/>
+      <w:r>
+        <w:t xml:space="preserve"> = True</w:t>
+      </w:r>
+    </w:p>
+    <w:p/>
+    <w:p>
+      <w:r>
+        <w:t xml:space="preserve">                </w:t>
+      </w:r>
+      <w:proofErr w:type="spellStart"/>
+      <w:r>
+        <w:t>elif</w:t>
+      </w:r>
+      <w:proofErr w:type="spellEnd"/>
+      <w:r>
+        <w:t xml:space="preserve"> </w:t>
+      </w:r>
+      <w:proofErr w:type="spellStart"/>
+      <w:r>
+        <w:t>event.type</w:t>
+      </w:r>
+      <w:proofErr w:type="spellEnd"/>
+      <w:r>
+        <w:t xml:space="preserve"> == </w:t>
+      </w:r>
+      <w:proofErr w:type="spellStart"/>
+      <w:r>
+        <w:t>p.KEYDOWN</w:t>
+      </w:r>
+      <w:proofErr w:type="spellEnd"/>
+      <w:r>
+        <w:t xml:space="preserve"> and </w:t>
+      </w:r>
+      <w:proofErr w:type="spellStart"/>
+      <w:r>
         <w:t>self.game.pending_promotion</w:t>
       </w:r>
       <w:proofErr w:type="spellEnd"/>
       <w:r>
+        <w:t>:</w:t>
+      </w:r>
+    </w:p>
+    <w:p>
+      <w:r>
+        <w:t xml:space="preserve">                    if </w:t>
+      </w:r>
+      <w:proofErr w:type="spellStart"/>
+      <w:r>
+        <w:t>event.key</w:t>
+      </w:r>
+      <w:proofErr w:type="spellEnd"/>
+      <w:r>
+        <w:t xml:space="preserve"> == p.K_q:</w:t>
+      </w:r>
+    </w:p>
+    <w:p>
+      <w:r>
+        <w:t xml:space="preserve">                        </w:t>
+      </w:r>
+      <w:proofErr w:type="spellStart"/>
+      <w:r>
+        <w:t>self.game.promote_pawn</w:t>
+      </w:r>
+      <w:proofErr w:type="spellEnd"/>
+      <w:r>
+        <w:t>(</w:t>
+      </w:r>
+      <w:proofErr w:type="spellStart"/>
+      <w:r>
+        <w:t>self.game.pending_promotion</w:t>
+      </w:r>
+      <w:proofErr w:type="spellEnd"/>
+      <w:r>
+        <w:t>, "Queen")</w:t>
+      </w:r>
+    </w:p>
+    <w:p>
+      <w:r>
+        <w:t xml:space="preserve">                    </w:t>
+      </w:r>
+      <w:proofErr w:type="spellStart"/>
+      <w:r>
+        <w:t>elif</w:t>
+      </w:r>
+      <w:proofErr w:type="spellEnd"/>
+      <w:r>
+        <w:t xml:space="preserve"> event.key == p.K_r:</w:t>
+      </w:r>
+    </w:p>
+    <w:p>
+      <w:r>
+        <w:t xml:space="preserve">                        </w:t>
+      </w:r>
+      <w:proofErr w:type="spellStart"/>
+      <w:r>
+        <w:t>self.game.promote_pawn</w:t>
+      </w:r>
+      <w:proofErr w:type="spellEnd"/>
+      <w:r>
+        <w:t>(</w:t>
+      </w:r>
+      <w:proofErr w:type="spellStart"/>
+      <w:r>
+        <w:t>self.game.pending_promotion</w:t>
+      </w:r>
+      <w:proofErr w:type="spellEnd"/>
+      <w:r>
+        <w:t>, "Rook")</w:t>
+      </w:r>
+    </w:p>
+    <w:p>
+      <w:r>
+        <w:t xml:space="preserve">                    </w:t>
+      </w:r>
+      <w:proofErr w:type="spellStart"/>
+      <w:r>
+        <w:t>elif</w:t>
+      </w:r>
+      <w:proofErr w:type="spellEnd"/>
+      <w:r>
+        <w:t xml:space="preserve"> event.key == p.K_b:</w:t>
+      </w:r>
+    </w:p>
+    <w:p>
+      <w:r>
+        <w:t xml:space="preserve">                        </w:t>
+      </w:r>
+      <w:proofErr w:type="spellStart"/>
+      <w:r>
+        <w:t>self.game.promote_pawn</w:t>
+      </w:r>
+      <w:proofErr w:type="spellEnd"/>
+      <w:r>
+        <w:t>(</w:t>
+      </w:r>
+      <w:proofErr w:type="spellStart"/>
+      <w:r>
+        <w:t>self.game.pending_promotion</w:t>
+      </w:r>
+      <w:proofErr w:type="spellEnd"/>
+      <w:r>
+        <w:t>, "Bishop")</w:t>
+      </w:r>
+    </w:p>
+    <w:p>
+      <w:r>
+        <w:t xml:space="preserve">                    </w:t>
+      </w:r>
+      <w:proofErr w:type="spellStart"/>
+      <w:r>
+        <w:t>elif</w:t>
+      </w:r>
+      <w:proofErr w:type="spellEnd"/>
+      <w:r>
+        <w:t xml:space="preserve"> event.key == p.K_n:</w:t>
+      </w:r>
+    </w:p>
+    <w:p>
+      <w:r>
+        <w:t xml:space="preserve">                        </w:t>
+      </w:r>
+      <w:proofErr w:type="spellStart"/>
+      <w:r>
+        <w:t>self.game.promote_pawn</w:t>
+      </w:r>
+      <w:proofErr w:type="spellEnd"/>
+      <w:r>
+        <w:t>(</w:t>
+      </w:r>
+      <w:proofErr w:type="spellStart"/>
+      <w:r>
+        <w:t>self.game.pending_promotion</w:t>
+      </w:r>
+      <w:proofErr w:type="spellEnd"/>
+      <w:r>
+        <w:t>, "Knight")</w:t>
+      </w:r>
+    </w:p>
+    <w:p/>
+    <w:p>
+      <w:r>
+        <w:t xml:space="preserve">                    </w:t>
+      </w:r>
+      <w:proofErr w:type="spellStart"/>
+      <w:r>
+        <w:t>self.game.pending_promotion</w:t>
+      </w:r>
+      <w:proofErr w:type="spellEnd"/>
+      <w:r>
+        <w:t xml:space="preserve"> = None</w:t>
+      </w:r>
+    </w:p>
+    <w:p/>
+    <w:p>
+      <w:r>
+        <w:t xml:space="preserve">            if </w:t>
+      </w:r>
+      <w:proofErr w:type="spellStart"/>
+      <w:r>
+        <w:t>self.game.started</w:t>
+      </w:r>
+      <w:proofErr w:type="spellEnd"/>
+      <w:r>
         <w:t xml:space="preserve"> and </w:t>
       </w:r>
       <w:proofErr w:type="spellStart"/>
       <w:r>
-        <w:t>self.game.started</w:t>
+        <w:t>self.game.vs_ai</w:t>
+      </w:r>
+      <w:proofErr w:type="spellEnd"/>
+      <w:r>
+        <w:t xml:space="preserve"> and self.game.ai:</w:t>
+      </w:r>
+    </w:p>
+    <w:p>
+      <w:r>
+        <w:t xml:space="preserve">                if </w:t>
+      </w:r>
+      <w:proofErr w:type="spellStart"/>
+      <w:r>
+        <w:t>self.game.turn</w:t>
+      </w:r>
+      <w:proofErr w:type="spellEnd"/>
+      <w:r>
+        <w:t xml:space="preserve"> == </w:t>
+      </w:r>
+      <w:proofErr w:type="spellStart"/>
+      <w:r>
+        <w:t>self.game.ai.colour</w:t>
+      </w:r>
+      <w:proofErr w:type="spellEnd"/>
+      <w:r>
+        <w:t xml:space="preserve"> and not </w:t>
+      </w:r>
+      <w:proofErr w:type="spellStart"/>
+      <w:r>
+        <w:t>self.game.pending_promotion</w:t>
       </w:r>
       <w:proofErr w:type="spellEnd"/>
       <w:r>
         <w:t>:</w:t>
       </w:r>
     </w:p>
-    <w:p>
-      <w:r>
-        <w:t xml:space="preserve">                    </w:t>
-      </w:r>
-      <w:proofErr w:type="spellStart"/>
-      <w:r>
-        <w:t>self.game.handle_click</w:t>
+    <w:p/>
+    <w:p>
+      <w:r>
+        <w:t xml:space="preserve">                    move = </w:t>
+      </w:r>
+      <w:proofErr w:type="spellStart"/>
+      <w:r>
+        <w:t>self.game.ai.find_best_move</w:t>
       </w:r>
       <w:proofErr w:type="spellEnd"/>
       <w:r>
@@ -18574,7 +19010,7 @@
       </w:r>
       <w:proofErr w:type="spellStart"/>
       <w:r>
-        <w:t>pos</w:t>
+        <w:t>self.game.board</w:t>
       </w:r>
       <w:proofErr w:type="spellEnd"/>
       <w:r>
@@ -18583,70 +19019,7 @@
     </w:p>
     <w:p>
       <w:r>
-        <w:t xml:space="preserve">                </w:t>
-      </w:r>
-      <w:proofErr w:type="spellStart"/>
-      <w:r>
-        <w:t>elif</w:t>
-      </w:r>
-      <w:proofErr w:type="spellEnd"/>
-      <w:r>
-        <w:t xml:space="preserve"> </w:t>
-      </w:r>
-      <w:proofErr w:type="spellStart"/>
-      <w:r>
-        <w:t>event.type</w:t>
-      </w:r>
-      <w:proofErr w:type="spellEnd"/>
-      <w:r>
-        <w:t xml:space="preserve"> == </w:t>
-      </w:r>
-      <w:proofErr w:type="spellStart"/>
-      <w:r>
-        <w:t>p.MOUSEBUTTONDOWN</w:t>
-      </w:r>
-      <w:proofErr w:type="spellEnd"/>
-      <w:r>
-        <w:t xml:space="preserve"> and not </w:t>
-      </w:r>
-      <w:proofErr w:type="spellStart"/>
-      <w:r>
-        <w:t>self.game.started</w:t>
-      </w:r>
-      <w:proofErr w:type="spellEnd"/>
-      <w:r>
-        <w:t>:</w:t>
-      </w:r>
-    </w:p>
-    <w:p>
-      <w:r>
-        <w:t xml:space="preserve">                    result = </w:t>
-      </w:r>
-      <w:proofErr w:type="spellStart"/>
-      <w:r>
-        <w:t>self.rendering.start_menu_click</w:t>
-      </w:r>
-      <w:proofErr w:type="spellEnd"/>
-      <w:r>
-        <w:t>(</w:t>
-      </w:r>
-      <w:proofErr w:type="spellStart"/>
-      <w:r>
-        <w:t>p.mouse.get_pos</w:t>
-      </w:r>
-      <w:proofErr w:type="spellEnd"/>
-      <w:r>
-        <w:t>())</w:t>
-      </w:r>
-    </w:p>
-    <w:p>
-      <w:r>
-        <w:t>                    if result:</w:t>
-      </w:r>
-    </w:p>
-    <w:p>
-      <w:r>
-        <w:t>                        kind, value = result</w:t>
+        <w:t>                    if move:</w:t>
       </w:r>
     </w:p>
     <w:p>
@@ -18655,488 +19028,11 @@
       </w:r>
       <w:proofErr w:type="spellStart"/>
       <w:r>
-        <w:t>self.game.handle_start_menu_choice</w:t>
-      </w:r>
-      <w:proofErr w:type="spellEnd"/>
-      <w:r>
-        <w:t>(kind, value)</w:t>
-      </w:r>
-    </w:p>
-    <w:p>
-      <w:r>
-        <w:t>                        print("Menu choice:", kind, value)</w:t>
-      </w:r>
-    </w:p>
-    <w:p>
-      <w:r>
-        <w:t xml:space="preserve">                        print("Player colour:", </w:t>
-      </w:r>
-      <w:proofErr w:type="spellStart"/>
-      <w:r>
-        <w:t>self.game.player_colour</w:t>
-      </w:r>
-      <w:proofErr w:type="spellEnd"/>
-      <w:r>
-        <w:t>)</w:t>
-      </w:r>
-    </w:p>
-    <w:p>
-      <w:r>
-        <w:t xml:space="preserve">                        print("Vs AI:", </w:t>
-      </w:r>
-      <w:proofErr w:type="spellStart"/>
-      <w:r>
-        <w:t>self.game.vs_ai</w:t>
-      </w:r>
-      <w:proofErr w:type="spellEnd"/>
-      <w:r>
-        <w:t>)</w:t>
-      </w:r>
-    </w:p>
-    <w:p/>
-    <w:p>
-      <w:r>
-        <w:t>                    # CREATE AI HERE</w:t>
-      </w:r>
-    </w:p>
-    <w:p>
-      <w:r>
-        <w:t xml:space="preserve">                        if </w:t>
-      </w:r>
-      <w:proofErr w:type="spellStart"/>
-      <w:r>
-        <w:t>self.game.vs_ai</w:t>
-      </w:r>
-      <w:proofErr w:type="spellEnd"/>
-      <w:r>
-        <w:t xml:space="preserve"> and self.game.ai is None and </w:t>
-      </w:r>
-      <w:proofErr w:type="spellStart"/>
-      <w:r>
-        <w:t>self.game.player_colour</w:t>
-      </w:r>
-      <w:proofErr w:type="spellEnd"/>
-      <w:r>
-        <w:t xml:space="preserve"> is not None:</w:t>
-      </w:r>
-    </w:p>
-    <w:p>
-      <w:r>
-        <w:t xml:space="preserve">                            </w:t>
-      </w:r>
-      <w:proofErr w:type="spellStart"/>
-      <w:r>
-        <w:t>ai_colour</w:t>
-      </w:r>
-      <w:proofErr w:type="spellEnd"/>
-      <w:r>
-        <w:t xml:space="preserve"> = "black" if </w:t>
-      </w:r>
-      <w:proofErr w:type="spellStart"/>
-      <w:r>
-        <w:t>self.game.player_colour</w:t>
-      </w:r>
-      <w:proofErr w:type="spellEnd"/>
-      <w:r>
-        <w:t xml:space="preserve"> == "white" else "white"</w:t>
-      </w:r>
-    </w:p>
-    <w:p>
-      <w:r>
-        <w:t xml:space="preserve">                            self.game.ai = </w:t>
-      </w:r>
-      <w:proofErr w:type="spellStart"/>
-      <w:r>
-        <w:t>ChessAI</w:t>
-      </w:r>
-      <w:proofErr w:type="spellEnd"/>
-      <w:r>
-        <w:t>(</w:t>
-      </w:r>
-      <w:proofErr w:type="spellStart"/>
-      <w:r>
-        <w:t>ai_colour</w:t>
-      </w:r>
-      <w:proofErr w:type="spellEnd"/>
-      <w:r>
-        <w:t>, depth=2)</w:t>
-      </w:r>
-    </w:p>
-    <w:p>
-      <w:r>
-        <w:t xml:space="preserve">                            </w:t>
-      </w:r>
-      <w:proofErr w:type="spellStart"/>
-      <w:r>
-        <w:t>self.analysis_window</w:t>
-      </w:r>
-      <w:proofErr w:type="spellEnd"/>
-      <w:r>
-        <w:t xml:space="preserve"> = </w:t>
-      </w:r>
-      <w:proofErr w:type="spellStart"/>
-      <w:r>
-        <w:t>AnalysisWindow</w:t>
-      </w:r>
-      <w:proofErr w:type="spellEnd"/>
-      <w:r>
-        <w:t>(self.game.ai)</w:t>
-      </w:r>
-    </w:p>
-    <w:p>
-      <w:r>
-        <w:t xml:space="preserve">                            </w:t>
-      </w:r>
-      <w:proofErr w:type="spellStart"/>
-      <w:r>
-        <w:t>self.game.started</w:t>
-      </w:r>
-      <w:proofErr w:type="spellEnd"/>
-      <w:r>
-        <w:t xml:space="preserve"> = True</w:t>
-      </w:r>
-    </w:p>
-    <w:p/>
-    <w:p>
-      <w:r>
-        <w:t xml:space="preserve">                </w:t>
-      </w:r>
-      <w:proofErr w:type="spellStart"/>
-      <w:r>
-        <w:t>elif</w:t>
-      </w:r>
-      <w:proofErr w:type="spellEnd"/>
-      <w:r>
-        <w:t xml:space="preserve"> </w:t>
-      </w:r>
-      <w:proofErr w:type="spellStart"/>
-      <w:r>
-        <w:t>event.type</w:t>
-      </w:r>
-      <w:proofErr w:type="spellEnd"/>
-      <w:r>
-        <w:t xml:space="preserve"> == </w:t>
-      </w:r>
-      <w:proofErr w:type="spellStart"/>
-      <w:r>
-        <w:t>p.KEYDOWN</w:t>
-      </w:r>
-      <w:proofErr w:type="spellEnd"/>
-      <w:r>
-        <w:t xml:space="preserve"> and </w:t>
-      </w:r>
-      <w:proofErr w:type="spellStart"/>
-      <w:r>
-        <w:t>self.game.pending_promotion</w:t>
-      </w:r>
-      <w:proofErr w:type="spellEnd"/>
-      <w:r>
-        <w:t>:</w:t>
-      </w:r>
-    </w:p>
-    <w:p>
-      <w:r>
-        <w:t xml:space="preserve">                    if </w:t>
-      </w:r>
-      <w:proofErr w:type="spellStart"/>
-      <w:r>
-        <w:t>event.key</w:t>
-      </w:r>
-      <w:proofErr w:type="spellEnd"/>
-      <w:r>
-        <w:t xml:space="preserve"> == </w:t>
-      </w:r>
-      <w:proofErr w:type="spellStart"/>
-      <w:r>
-        <w:t>p.K_q</w:t>
-      </w:r>
-      <w:proofErr w:type="spellEnd"/>
-      <w:r>
-        <w:t>:</w:t>
-      </w:r>
-    </w:p>
-    <w:p>
-      <w:r>
-        <w:t xml:space="preserve">                        </w:t>
-      </w:r>
-      <w:proofErr w:type="spellStart"/>
-      <w:r>
-        <w:t>self.game.promote_pawn</w:t>
-      </w:r>
-      <w:proofErr w:type="spellEnd"/>
-      <w:r>
-        <w:t>(</w:t>
-      </w:r>
-      <w:proofErr w:type="spellStart"/>
-      <w:r>
-        <w:t>self.game.pending_promotion</w:t>
-      </w:r>
-      <w:proofErr w:type="spellEnd"/>
-      <w:r>
-        <w:t>, "Queen")</w:t>
-      </w:r>
-    </w:p>
-    <w:p>
-      <w:r>
-        <w:t xml:space="preserve">                    </w:t>
-      </w:r>
-      <w:proofErr w:type="spellStart"/>
-      <w:r>
-        <w:t>elif</w:t>
-      </w:r>
-      <w:proofErr w:type="spellEnd"/>
-      <w:r>
-        <w:t xml:space="preserve"> </w:t>
-      </w:r>
-      <w:proofErr w:type="spellStart"/>
-      <w:r>
-        <w:t>event.key</w:t>
-      </w:r>
-      <w:proofErr w:type="spellEnd"/>
-      <w:r>
-        <w:t xml:space="preserve"> == </w:t>
-      </w:r>
-      <w:proofErr w:type="spellStart"/>
-      <w:r>
-        <w:t>p.K_r</w:t>
-      </w:r>
-      <w:proofErr w:type="spellEnd"/>
-      <w:r>
-        <w:t>:</w:t>
-      </w:r>
-    </w:p>
-    <w:p>
-      <w:r>
-        <w:t xml:space="preserve">                        </w:t>
-      </w:r>
-      <w:proofErr w:type="spellStart"/>
-      <w:r>
-        <w:t>self.game.promote_pawn</w:t>
-      </w:r>
-      <w:proofErr w:type="spellEnd"/>
-      <w:r>
-        <w:t>(</w:t>
-      </w:r>
-      <w:proofErr w:type="spellStart"/>
-      <w:r>
-        <w:t>self.game.pending_promotion</w:t>
-      </w:r>
-      <w:proofErr w:type="spellEnd"/>
-      <w:r>
-        <w:t>, "Rook")</w:t>
-      </w:r>
-    </w:p>
-    <w:p>
-      <w:r>
-        <w:t xml:space="preserve">                    </w:t>
-      </w:r>
-      <w:proofErr w:type="spellStart"/>
-      <w:r>
-        <w:t>elif</w:t>
-      </w:r>
-      <w:proofErr w:type="spellEnd"/>
-      <w:r>
-        <w:t xml:space="preserve"> </w:t>
-      </w:r>
-      <w:proofErr w:type="spellStart"/>
-      <w:r>
-        <w:t>event.key</w:t>
-      </w:r>
-      <w:proofErr w:type="spellEnd"/>
-      <w:r>
-        <w:t xml:space="preserve"> == </w:t>
-      </w:r>
-      <w:proofErr w:type="spellStart"/>
-      <w:r>
-        <w:t>p.K_b</w:t>
-      </w:r>
-      <w:proofErr w:type="spellEnd"/>
-      <w:r>
-        <w:t>:</w:t>
-      </w:r>
-    </w:p>
-    <w:p>
-      <w:r>
-        <w:t xml:space="preserve">                        </w:t>
-      </w:r>
-      <w:proofErr w:type="spellStart"/>
-      <w:r>
-        <w:t>self.game.promote_pawn</w:t>
-      </w:r>
-      <w:proofErr w:type="spellEnd"/>
-      <w:r>
-        <w:t>(</w:t>
-      </w:r>
-      <w:proofErr w:type="spellStart"/>
-      <w:r>
-        <w:t>self.game.pending_promotion</w:t>
-      </w:r>
-      <w:proofErr w:type="spellEnd"/>
-      <w:r>
-        <w:t>, "Bishop")</w:t>
-      </w:r>
-    </w:p>
-    <w:p>
-      <w:r>
-        <w:t xml:space="preserve">                    </w:t>
-      </w:r>
-      <w:proofErr w:type="spellStart"/>
-      <w:r>
-        <w:t>elif</w:t>
-      </w:r>
-      <w:proofErr w:type="spellEnd"/>
-      <w:r>
-        <w:t xml:space="preserve"> </w:t>
-      </w:r>
-      <w:proofErr w:type="spellStart"/>
-      <w:r>
-        <w:t>event.key</w:t>
-      </w:r>
-      <w:proofErr w:type="spellEnd"/>
-      <w:r>
-        <w:t xml:space="preserve"> == </w:t>
-      </w:r>
-      <w:proofErr w:type="spellStart"/>
-      <w:r>
-        <w:t>p.K_n</w:t>
-      </w:r>
-      <w:proofErr w:type="spellEnd"/>
-      <w:r>
-        <w:t>:</w:t>
-      </w:r>
-    </w:p>
-    <w:p>
-      <w:r>
-        <w:t xml:space="preserve">                        </w:t>
-      </w:r>
-      <w:proofErr w:type="spellStart"/>
-      <w:r>
-        <w:t>self.game.promote_pawn</w:t>
-      </w:r>
-      <w:proofErr w:type="spellEnd"/>
-      <w:r>
-        <w:t>(</w:t>
-      </w:r>
-      <w:proofErr w:type="spellStart"/>
-      <w:r>
-        <w:t>self.game.pending_promotion</w:t>
-      </w:r>
-      <w:proofErr w:type="spellEnd"/>
-      <w:r>
-        <w:t>, "Knight")</w:t>
-      </w:r>
-    </w:p>
-    <w:p/>
-    <w:p>
-      <w:r>
-        <w:t xml:space="preserve">                    </w:t>
-      </w:r>
-      <w:proofErr w:type="spellStart"/>
-      <w:r>
-        <w:t>self.game.pending_promotion</w:t>
-      </w:r>
-      <w:proofErr w:type="spellEnd"/>
-      <w:r>
-        <w:t xml:space="preserve"> = None</w:t>
-      </w:r>
-    </w:p>
-    <w:p/>
-    <w:p>
-      <w:r>
-        <w:t xml:space="preserve">            if </w:t>
-      </w:r>
-      <w:proofErr w:type="spellStart"/>
-      <w:r>
-        <w:t>self.game.started</w:t>
-      </w:r>
-      <w:proofErr w:type="spellEnd"/>
-      <w:r>
-        <w:t xml:space="preserve"> and </w:t>
-      </w:r>
-      <w:proofErr w:type="spellStart"/>
-      <w:r>
-        <w:t>self.game.vs_ai</w:t>
-      </w:r>
-      <w:proofErr w:type="spellEnd"/>
-      <w:r>
-        <w:t xml:space="preserve"> and self.game.ai:</w:t>
-      </w:r>
-    </w:p>
-    <w:p>
-      <w:r>
-        <w:t xml:space="preserve">                if </w:t>
-      </w:r>
-      <w:proofErr w:type="spellStart"/>
-      <w:r>
-        <w:t>self.game.turn</w:t>
-      </w:r>
-      <w:proofErr w:type="spellEnd"/>
-      <w:r>
-        <w:t xml:space="preserve"> == </w:t>
-      </w:r>
-      <w:proofErr w:type="spellStart"/>
-      <w:r>
-        <w:t>self.game.ai.colour</w:t>
-      </w:r>
-      <w:proofErr w:type="spellEnd"/>
-      <w:r>
-        <w:t xml:space="preserve"> and not </w:t>
-      </w:r>
-      <w:proofErr w:type="spellStart"/>
-      <w:r>
-        <w:t>self.game.pending_promotion</w:t>
-      </w:r>
-      <w:proofErr w:type="spellEnd"/>
-      <w:r>
-        <w:t>:</w:t>
-      </w:r>
-    </w:p>
-    <w:p/>
-    <w:p>
-      <w:r>
-        <w:t xml:space="preserve">                    move = </w:t>
-      </w:r>
-      <w:proofErr w:type="spellStart"/>
-      <w:r>
-        <w:t>self.game.ai.find_best_move</w:t>
-      </w:r>
-      <w:proofErr w:type="spellEnd"/>
-      <w:r>
-        <w:t>(</w:t>
-      </w:r>
-      <w:proofErr w:type="spellStart"/>
-      <w:r>
-        <w:t>self.game.board</w:t>
-      </w:r>
-      <w:proofErr w:type="spellEnd"/>
-      <w:r>
-        <w:t>)</w:t>
-      </w:r>
-    </w:p>
-    <w:p>
-      <w:r>
-        <w:t>                    if move:</w:t>
-      </w:r>
-    </w:p>
-    <w:p>
-      <w:r>
-        <w:t xml:space="preserve">                        </w:t>
-      </w:r>
-      <w:proofErr w:type="spellStart"/>
-      <w:r>
         <w:t>from_pos</w:t>
       </w:r>
       <w:proofErr w:type="spellEnd"/>
       <w:r>
-        <w:t xml:space="preserve">, </w:t>
-      </w:r>
-      <w:proofErr w:type="spellStart"/>
-      <w:r>
-        <w:t>to_pos</w:t>
-      </w:r>
-      <w:proofErr w:type="spellEnd"/>
-      <w:r>
-        <w:t xml:space="preserve"> = move</w:t>
+        <w:t>, to_pos = move</w:t>
       </w:r>
     </w:p>
     <w:p>
@@ -24713,6 +24609,9 @@
     <w:p/>
     <w:p>
       <w:r>
+        <w:rPr>
+          <w:noProof/>
+        </w:rPr>
         <w:lastRenderedPageBreak/>
         <w:drawing>
           <wp:inline distT="0" distB="0" distL="0" distR="0" wp14:anchorId="4D851FA0" wp14:editId="36077DEA">
@@ -25033,25 +24932,7 @@
           </w:tcPr>
           <w:p>
             <w:r>
-              <w:t>Pieces use inheritance, encapsulation, and polymorphism. Board class manages game state separately.</w:t>
-            </w:r>
-            <w:r>
-              <w:t xml:space="preserve"> </w:t>
-            </w:r>
-            <w:r>
-              <w:t>Pieces can query the board to detect blockers or captures. Board maintains grid integrity.</w:t>
-            </w:r>
-            <w:r>
-              <w:t xml:space="preserve"> </w:t>
-            </w:r>
-            <w:r>
-              <w:t>Each piece generates its own legal moves; moves are validated to not leave the king in check.</w:t>
-            </w:r>
-            <w:r>
-              <w:t xml:space="preserve"> </w:t>
-            </w:r>
-            <w:r>
-              <w:t>Adding a new piece type or rule requires minimal changes outside that piece class.</w:t>
+              <w:t>Pieces use inheritance, encapsulation, and polymorphism. Board class manages game state separately. Pieces can query the board to detect blockers or captures. Board maintains grid integrity. Each piece generates its own legal moves; moves are validated to not leave the king in check. Adding a new piece type or rule requires minimal changes outside that piece class.</w:t>
             </w:r>
           </w:p>
         </w:tc>
@@ -25061,25 +24942,7 @@
           </w:tcPr>
           <w:p>
             <w:r>
-              <w:t>Clear class hierarchy with Piece base class and subclasses. Encapsulation and polymorphism used.</w:t>
-            </w:r>
-            <w:r>
-              <w:t xml:space="preserve"> </w:t>
-            </w:r>
-            <w:r>
-              <w:t>New piece types can be added by subclassing Piece; existing AI works without changes.</w:t>
-            </w:r>
-            <w:r>
-              <w:t xml:space="preserve"> </w:t>
-            </w:r>
-            <w:r>
-              <w:t>Testing confirms moves are generated correctly; illegal moves blocked; king safety enforced.</w:t>
-            </w:r>
-            <w:r>
-              <w:t xml:space="preserve"> </w:t>
-            </w:r>
-            <w:r>
-              <w:t>Board manages placement and movement; pieces query board for blockers.</w:t>
+              <w:t>Clear class hierarchy with Piece base class and subclasses. Encapsulation and polymorphism used. New piece types can be added by subclassing Piece; existing AI works without changes. Testing confirms moves are generated correctly; illegal moves blocked; king safety enforced. Board manages placement and movement; pieces query board for blockers.</w:t>
             </w:r>
           </w:p>
         </w:tc>
@@ -28348,6 +28211,7 @@
   <w:style w:type="character" w:default="1" w:styleId="DefaultParagraphFont">
     <w:name w:val="Default Paragraph Font"/>
     <w:uiPriority w:val="1"/>
+    <w:semiHidden/>
     <w:unhideWhenUsed/>
   </w:style>
   <w:style w:type="table" w:default="1" w:styleId="TableNormal">
@@ -29171,14 +29035,6 @@
 </file>
 
 <file path=customXml/item1.xml><?xml version="1.0" encoding="utf-8"?>
-<p:properties xmlns:p="http://schemas.microsoft.com/office/2006/metadata/properties" xmlns:xsi="http://www.w3.org/2001/XMLSchema-instance" xmlns:pc="http://schemas.microsoft.com/office/infopath/2007/PartnerControls">
-  <documentManagement>
-    <_activity xmlns="c6075eba-c07e-4702-af27-fa2aaf905554" xsi:nil="true"/>
-  </documentManagement>
-</p:properties>
-</file>
-
-<file path=customXml/item2.xml><?xml version="1.0" encoding="utf-8"?>
 <ct:contentTypeSchema xmlns:ct="http://schemas.microsoft.com/office/2006/metadata/contentType" xmlns:ma="http://schemas.microsoft.com/office/2006/metadata/properties/metaAttributes" ct:_="" ma:_="" ma:contentTypeName="Document" ma:contentTypeID="0x0101006CA2363EE22CFD458A0797AA079175AC" ma:contentTypeVersion="11" ma:contentTypeDescription="Create a new document." ma:contentTypeScope="" ma:versionID="b7d449344367b701d150012a16725f46">
   <xsd:schema xmlns:xsd="http://www.w3.org/2001/XMLSchema" xmlns:xs="http://www.w3.org/2001/XMLSchema" xmlns:p="http://schemas.microsoft.com/office/2006/metadata/properties" xmlns:ns3="c6075eba-c07e-4702-af27-fa2aaf905554" targetNamespace="http://schemas.microsoft.com/office/2006/metadata/properties" ma:root="true" ma:fieldsID="65f643815429fbf2afa205432ae97806" ns3:_="">
     <xsd:import namespace="c6075eba-c07e-4702-af27-fa2aaf905554"/>
@@ -29366,11 +29222,7 @@
 </ct:contentTypeSchema>
 </file>
 
-<file path=customXml/item3.xml><?xml version="1.0" encoding="utf-8"?>
-<b:Sources xmlns:b="http://schemas.openxmlformats.org/officeDocument/2006/bibliography" xmlns="http://schemas.openxmlformats.org/officeDocument/2006/bibliography" SelectedStyle="\APASixthEditionOfficeOnline.xsl" StyleName="APA" Version="6"/>
-</file>
-
-<file path=customXml/item4.xml><?xml version="1.0" encoding="utf-8"?>
+<file path=customXml/item2.xml><?xml version="1.0" encoding="utf-8"?>
 <?mso-contentType ?>
 <FormTemplates xmlns="http://schemas.microsoft.com/sharepoint/v3/contenttype/forms">
   <Display>DocumentLibraryForm</Display>
@@ -29379,17 +29231,19 @@
 </FormTemplates>
 </file>
 
-<file path=customXml/itemProps1.xml><?xml version="1.0" encoding="utf-8"?>
-<ds:datastoreItem xmlns:ds="http://schemas.openxmlformats.org/officeDocument/2006/customXml" ds:itemID="{5B726337-09AC-47F1-8028-BEB6EF533241}">
-  <ds:schemaRefs>
-    <ds:schemaRef ds:uri="http://schemas.microsoft.com/office/2006/metadata/properties"/>
-    <ds:schemaRef ds:uri="http://schemas.microsoft.com/office/infopath/2007/PartnerControls"/>
-    <ds:schemaRef ds:uri="c6075eba-c07e-4702-af27-fa2aaf905554"/>
-  </ds:schemaRefs>
-</ds:datastoreItem>
+<file path=customXml/item3.xml><?xml version="1.0" encoding="utf-8"?>
+<b:Sources xmlns:b="http://schemas.openxmlformats.org/officeDocument/2006/bibliography" xmlns="http://schemas.openxmlformats.org/officeDocument/2006/bibliography" SelectedStyle="\APASixthEditionOfficeOnline.xsl" StyleName="APA" Version="6"/>
 </file>
 
-<file path=customXml/itemProps2.xml><?xml version="1.0" encoding="utf-8"?>
+<file path=customXml/item4.xml><?xml version="1.0" encoding="utf-8"?>
+<p:properties xmlns:p="http://schemas.microsoft.com/office/2006/metadata/properties" xmlns:xsi="http://www.w3.org/2001/XMLSchema-instance" xmlns:pc="http://schemas.microsoft.com/office/infopath/2007/PartnerControls">
+  <documentManagement>
+    <_activity xmlns="c6075eba-c07e-4702-af27-fa2aaf905554" xsi:nil="true"/>
+  </documentManagement>
+</p:properties>
+</file>
+
+<file path=customXml/itemProps1.xml><?xml version="1.0" encoding="utf-8"?>
 <ds:datastoreItem xmlns:ds="http://schemas.openxmlformats.org/officeDocument/2006/customXml" ds:itemID="{855AA73F-4A65-4429-8229-4CB46CFDA5EA}">
   <ds:schemaRefs>
     <ds:schemaRef ds:uri="http://schemas.microsoft.com/office/2006/metadata/contentType"/>
@@ -29407,6 +29261,14 @@
 </ds:datastoreItem>
 </file>
 
+<file path=customXml/itemProps2.xml><?xml version="1.0" encoding="utf-8"?>
+<ds:datastoreItem xmlns:ds="http://schemas.openxmlformats.org/officeDocument/2006/customXml" ds:itemID="{A0712809-C35E-44D9-9BF5-2957DB0041BE}">
+  <ds:schemaRefs>
+    <ds:schemaRef ds:uri="http://schemas.microsoft.com/sharepoint/v3/contenttype/forms"/>
+  </ds:schemaRefs>
+</ds:datastoreItem>
+</file>
+
 <file path=customXml/itemProps3.xml><?xml version="1.0" encoding="utf-8"?>
 <ds:datastoreItem xmlns:ds="http://schemas.openxmlformats.org/officeDocument/2006/customXml" ds:itemID="{64951C4C-C1FD-48A0-9079-4FE4363E8616}">
   <ds:schemaRefs>
@@ -29416,9 +29278,11 @@
 </file>
 
 <file path=customXml/itemProps4.xml><?xml version="1.0" encoding="utf-8"?>
-<ds:datastoreItem xmlns:ds="http://schemas.openxmlformats.org/officeDocument/2006/customXml" ds:itemID="{A0712809-C35E-44D9-9BF5-2957DB0041BE}">
+<ds:datastoreItem xmlns:ds="http://schemas.openxmlformats.org/officeDocument/2006/customXml" ds:itemID="{5B726337-09AC-47F1-8028-BEB6EF533241}">
   <ds:schemaRefs>
-    <ds:schemaRef ds:uri="http://schemas.microsoft.com/sharepoint/v3/contenttype/forms"/>
+    <ds:schemaRef ds:uri="http://schemas.microsoft.com/office/2006/metadata/properties"/>
+    <ds:schemaRef ds:uri="http://schemas.microsoft.com/office/infopath/2007/PartnerControls"/>
+    <ds:schemaRef ds:uri="c6075eba-c07e-4702-af27-fa2aaf905554"/>
   </ds:schemaRefs>
 </ds:datastoreItem>
 </file>
</xml_diff>